<commit_message>
solved some great logical questions
</commit_message>
<xml_diff>
--- a/advanced logic round.docx
+++ b/advanced logic round.docx
@@ -1227,7 +1227,27 @@
           <w:szCs w:val="24"/>
           <w:lang w:eastAsia="en-IN"/>
         </w:rPr>
-        <w:t xml:space="preserve"> In one step you can:</w:t>
+        <w:t xml:space="preserve"> </w:t>
+      </w:r>
+      <w:proofErr w:type="gramStart"/>
+      <w:r>
+        <w:rPr>
+          <w:rFonts w:ascii="Times New Roman" w:eastAsia="Times New Roman" w:hAnsi="Times New Roman" w:cs="Times New Roman"/>
+          <w:sz w:val="24"/>
+          <w:szCs w:val="24"/>
+          <w:lang w:eastAsia="en-IN"/>
+        </w:rPr>
+        <w:t>In</w:t>
+      </w:r>
+      <w:proofErr w:type="gramEnd"/>
+      <w:r>
+        <w:rPr>
+          <w:rFonts w:ascii="Times New Roman" w:eastAsia="Times New Roman" w:hAnsi="Times New Roman" w:cs="Times New Roman"/>
+          <w:sz w:val="24"/>
+          <w:szCs w:val="24"/>
+          <w:lang w:eastAsia="en-IN"/>
+        </w:rPr>
+        <w:t xml:space="preserve"> one step you can:</w:t>
       </w:r>
     </w:p>
     <w:p>
@@ -3176,7 +3196,47 @@
           <w:szCs w:val="24"/>
           <w:lang w:eastAsia="en-IN"/>
         </w:rPr>
-        <w:t xml:space="preserve">Replace digits where digit + freq + pos is even </w:t>
+        <w:t xml:space="preserve">Replace digits where digit + </w:t>
+      </w:r>
+      <w:proofErr w:type="spellStart"/>
+      <w:r>
+        <w:rPr>
+          <w:rFonts w:ascii="Times New Roman" w:eastAsia="Times New Roman" w:hAnsi="Times New Roman" w:cs="Times New Roman"/>
+          <w:sz w:val="24"/>
+          <w:szCs w:val="24"/>
+          <w:lang w:eastAsia="en-IN"/>
+        </w:rPr>
+        <w:t>freq</w:t>
+      </w:r>
+      <w:proofErr w:type="spellEnd"/>
+      <w:r>
+        <w:rPr>
+          <w:rFonts w:ascii="Times New Roman" w:eastAsia="Times New Roman" w:hAnsi="Times New Roman" w:cs="Times New Roman"/>
+          <w:sz w:val="24"/>
+          <w:szCs w:val="24"/>
+          <w:lang w:eastAsia="en-IN"/>
+        </w:rPr>
+        <w:t xml:space="preserve"> + </w:t>
+      </w:r>
+      <w:proofErr w:type="spellStart"/>
+      <w:r>
+        <w:rPr>
+          <w:rFonts w:ascii="Times New Roman" w:eastAsia="Times New Roman" w:hAnsi="Times New Roman" w:cs="Times New Roman"/>
+          <w:sz w:val="24"/>
+          <w:szCs w:val="24"/>
+          <w:lang w:eastAsia="en-IN"/>
+        </w:rPr>
+        <w:t>pos</w:t>
+      </w:r>
+      <w:proofErr w:type="spellEnd"/>
+      <w:r>
+        <w:rPr>
+          <w:rFonts w:ascii="Times New Roman" w:eastAsia="Times New Roman" w:hAnsi="Times New Roman" w:cs="Times New Roman"/>
+          <w:sz w:val="24"/>
+          <w:szCs w:val="24"/>
+          <w:lang w:eastAsia="en-IN"/>
+        </w:rPr>
+        <w:t xml:space="preserve"> is even </w:t>
       </w:r>
     </w:p>
     <w:p>
@@ -3200,7 +3260,47 @@
           <w:szCs w:val="24"/>
           <w:lang w:eastAsia="en-IN"/>
         </w:rPr>
-        <w:t xml:space="preserve">Replace digits where (digit × freq) + pos is prime </w:t>
+        <w:t xml:space="preserve">Replace digits where (digit × </w:t>
+      </w:r>
+      <w:proofErr w:type="spellStart"/>
+      <w:r>
+        <w:rPr>
+          <w:rFonts w:ascii="Times New Roman" w:eastAsia="Times New Roman" w:hAnsi="Times New Roman" w:cs="Times New Roman"/>
+          <w:sz w:val="24"/>
+          <w:szCs w:val="24"/>
+          <w:lang w:eastAsia="en-IN"/>
+        </w:rPr>
+        <w:t>freq</w:t>
+      </w:r>
+      <w:proofErr w:type="spellEnd"/>
+      <w:r>
+        <w:rPr>
+          <w:rFonts w:ascii="Times New Roman" w:eastAsia="Times New Roman" w:hAnsi="Times New Roman" w:cs="Times New Roman"/>
+          <w:sz w:val="24"/>
+          <w:szCs w:val="24"/>
+          <w:lang w:eastAsia="en-IN"/>
+        </w:rPr>
+        <w:t xml:space="preserve">) + </w:t>
+      </w:r>
+      <w:proofErr w:type="spellStart"/>
+      <w:r>
+        <w:rPr>
+          <w:rFonts w:ascii="Times New Roman" w:eastAsia="Times New Roman" w:hAnsi="Times New Roman" w:cs="Times New Roman"/>
+          <w:sz w:val="24"/>
+          <w:szCs w:val="24"/>
+          <w:lang w:eastAsia="en-IN"/>
+        </w:rPr>
+        <w:t>pos</w:t>
+      </w:r>
+      <w:proofErr w:type="spellEnd"/>
+      <w:r>
+        <w:rPr>
+          <w:rFonts w:ascii="Times New Roman" w:eastAsia="Times New Roman" w:hAnsi="Times New Roman" w:cs="Times New Roman"/>
+          <w:sz w:val="24"/>
+          <w:szCs w:val="24"/>
+          <w:lang w:eastAsia="en-IN"/>
+        </w:rPr>
+        <w:t xml:space="preserve"> is prime </w:t>
       </w:r>
     </w:p>
     <w:p>
@@ -3248,7 +3348,27 @@
           <w:szCs w:val="24"/>
           <w:lang w:eastAsia="en-IN"/>
         </w:rPr>
-        <w:t xml:space="preserve">Replace digits where digit³ − freq is prime </w:t>
+        <w:t xml:space="preserve">Replace digits where digit³ − </w:t>
+      </w:r>
+      <w:proofErr w:type="spellStart"/>
+      <w:r>
+        <w:rPr>
+          <w:rFonts w:ascii="Times New Roman" w:eastAsia="Times New Roman" w:hAnsi="Times New Roman" w:cs="Times New Roman"/>
+          <w:sz w:val="24"/>
+          <w:szCs w:val="24"/>
+          <w:lang w:eastAsia="en-IN"/>
+        </w:rPr>
+        <w:t>freq</w:t>
+      </w:r>
+      <w:proofErr w:type="spellEnd"/>
+      <w:r>
+        <w:rPr>
+          <w:rFonts w:ascii="Times New Roman" w:eastAsia="Times New Roman" w:hAnsi="Times New Roman" w:cs="Times New Roman"/>
+          <w:sz w:val="24"/>
+          <w:szCs w:val="24"/>
+          <w:lang w:eastAsia="en-IN"/>
+        </w:rPr>
+        <w:t xml:space="preserve"> is prime </w:t>
       </w:r>
     </w:p>
     <w:p>
@@ -3272,7 +3392,27 @@
           <w:szCs w:val="24"/>
           <w:lang w:eastAsia="en-IN"/>
         </w:rPr>
-        <w:t xml:space="preserve">Replace digits where digit + pos + running sum is even </w:t>
+        <w:t xml:space="preserve">Replace digits where digit + </w:t>
+      </w:r>
+      <w:proofErr w:type="spellStart"/>
+      <w:r>
+        <w:rPr>
+          <w:rFonts w:ascii="Times New Roman" w:eastAsia="Times New Roman" w:hAnsi="Times New Roman" w:cs="Times New Roman"/>
+          <w:sz w:val="24"/>
+          <w:szCs w:val="24"/>
+          <w:lang w:eastAsia="en-IN"/>
+        </w:rPr>
+        <w:t>pos</w:t>
+      </w:r>
+      <w:proofErr w:type="spellEnd"/>
+      <w:r>
+        <w:rPr>
+          <w:rFonts w:ascii="Times New Roman" w:eastAsia="Times New Roman" w:hAnsi="Times New Roman" w:cs="Times New Roman"/>
+          <w:sz w:val="24"/>
+          <w:szCs w:val="24"/>
+          <w:lang w:eastAsia="en-IN"/>
+        </w:rPr>
+        <w:t xml:space="preserve"> + running sum is even </w:t>
       </w:r>
     </w:p>
     <w:p>
@@ -3296,7 +3436,47 @@
           <w:szCs w:val="24"/>
           <w:lang w:eastAsia="en-IN"/>
         </w:rPr>
-        <w:t xml:space="preserve">Replace digits where digit × pos × freq is prime </w:t>
+        <w:t xml:space="preserve">Replace digits where digit × </w:t>
+      </w:r>
+      <w:proofErr w:type="spellStart"/>
+      <w:r>
+        <w:rPr>
+          <w:rFonts w:ascii="Times New Roman" w:eastAsia="Times New Roman" w:hAnsi="Times New Roman" w:cs="Times New Roman"/>
+          <w:sz w:val="24"/>
+          <w:szCs w:val="24"/>
+          <w:lang w:eastAsia="en-IN"/>
+        </w:rPr>
+        <w:t>pos</w:t>
+      </w:r>
+      <w:proofErr w:type="spellEnd"/>
+      <w:r>
+        <w:rPr>
+          <w:rFonts w:ascii="Times New Roman" w:eastAsia="Times New Roman" w:hAnsi="Times New Roman" w:cs="Times New Roman"/>
+          <w:sz w:val="24"/>
+          <w:szCs w:val="24"/>
+          <w:lang w:eastAsia="en-IN"/>
+        </w:rPr>
+        <w:t xml:space="preserve"> × </w:t>
+      </w:r>
+      <w:proofErr w:type="spellStart"/>
+      <w:r>
+        <w:rPr>
+          <w:rFonts w:ascii="Times New Roman" w:eastAsia="Times New Roman" w:hAnsi="Times New Roman" w:cs="Times New Roman"/>
+          <w:sz w:val="24"/>
+          <w:szCs w:val="24"/>
+          <w:lang w:eastAsia="en-IN"/>
+        </w:rPr>
+        <w:t>freq</w:t>
+      </w:r>
+      <w:proofErr w:type="spellEnd"/>
+      <w:r>
+        <w:rPr>
+          <w:rFonts w:ascii="Times New Roman" w:eastAsia="Times New Roman" w:hAnsi="Times New Roman" w:cs="Times New Roman"/>
+          <w:sz w:val="24"/>
+          <w:szCs w:val="24"/>
+          <w:lang w:eastAsia="en-IN"/>
+        </w:rPr>
+        <w:t xml:space="preserve"> is prime </w:t>
       </w:r>
     </w:p>
     <w:p>
@@ -3320,7 +3500,38 @@
           <w:szCs w:val="24"/>
           <w:lang w:eastAsia="en-IN"/>
         </w:rPr>
-        <w:t xml:space="preserve">Replace digits where (digit + pos)² is prime </w:t>
+        <w:t xml:space="preserve">Replace digits where (digit + </w:t>
+      </w:r>
+      <w:proofErr w:type="spellStart"/>
+      <w:proofErr w:type="gramStart"/>
+      <w:r>
+        <w:rPr>
+          <w:rFonts w:ascii="Times New Roman" w:eastAsia="Times New Roman" w:hAnsi="Times New Roman" w:cs="Times New Roman"/>
+          <w:sz w:val="24"/>
+          <w:szCs w:val="24"/>
+          <w:lang w:eastAsia="en-IN"/>
+        </w:rPr>
+        <w:t>pos</w:t>
+      </w:r>
+      <w:proofErr w:type="spellEnd"/>
+      <w:r>
+        <w:rPr>
+          <w:rFonts w:ascii="Times New Roman" w:eastAsia="Times New Roman" w:hAnsi="Times New Roman" w:cs="Times New Roman"/>
+          <w:sz w:val="24"/>
+          <w:szCs w:val="24"/>
+          <w:lang w:eastAsia="en-IN"/>
+        </w:rPr>
+        <w:t>)²</w:t>
+      </w:r>
+      <w:proofErr w:type="gramEnd"/>
+      <w:r>
+        <w:rPr>
+          <w:rFonts w:ascii="Times New Roman" w:eastAsia="Times New Roman" w:hAnsi="Times New Roman" w:cs="Times New Roman"/>
+          <w:sz w:val="24"/>
+          <w:szCs w:val="24"/>
+          <w:lang w:eastAsia="en-IN"/>
+        </w:rPr>
+        <w:t xml:space="preserve"> is prime </w:t>
       </w:r>
     </w:p>
     <w:p>
@@ -3405,7 +3616,27 @@
           <w:szCs w:val="24"/>
           <w:lang w:eastAsia="en-IN"/>
         </w:rPr>
-        <w:t xml:space="preserve">Remove digits where digit² + pos is even </w:t>
+        <w:t xml:space="preserve">Remove digits where digit² + </w:t>
+      </w:r>
+      <w:proofErr w:type="spellStart"/>
+      <w:r>
+        <w:rPr>
+          <w:rFonts w:ascii="Times New Roman" w:eastAsia="Times New Roman" w:hAnsi="Times New Roman" w:cs="Times New Roman"/>
+          <w:sz w:val="24"/>
+          <w:szCs w:val="24"/>
+          <w:lang w:eastAsia="en-IN"/>
+        </w:rPr>
+        <w:t>pos</w:t>
+      </w:r>
+      <w:proofErr w:type="spellEnd"/>
+      <w:r>
+        <w:rPr>
+          <w:rFonts w:ascii="Times New Roman" w:eastAsia="Times New Roman" w:hAnsi="Times New Roman" w:cs="Times New Roman"/>
+          <w:sz w:val="24"/>
+          <w:szCs w:val="24"/>
+          <w:lang w:eastAsia="en-IN"/>
+        </w:rPr>
+        <w:t xml:space="preserve"> is even </w:t>
       </w:r>
     </w:p>
     <w:p>
@@ -3429,7 +3660,27 @@
           <w:szCs w:val="24"/>
           <w:lang w:eastAsia="en-IN"/>
         </w:rPr>
-        <w:t xml:space="preserve">Keep digits where digit³ + freq is prime </w:t>
+        <w:t xml:space="preserve">Keep digits where digit³ + </w:t>
+      </w:r>
+      <w:proofErr w:type="spellStart"/>
+      <w:r>
+        <w:rPr>
+          <w:rFonts w:ascii="Times New Roman" w:eastAsia="Times New Roman" w:hAnsi="Times New Roman" w:cs="Times New Roman"/>
+          <w:sz w:val="24"/>
+          <w:szCs w:val="24"/>
+          <w:lang w:eastAsia="en-IN"/>
+        </w:rPr>
+        <w:t>freq</w:t>
+      </w:r>
+      <w:proofErr w:type="spellEnd"/>
+      <w:r>
+        <w:rPr>
+          <w:rFonts w:ascii="Times New Roman" w:eastAsia="Times New Roman" w:hAnsi="Times New Roman" w:cs="Times New Roman"/>
+          <w:sz w:val="24"/>
+          <w:szCs w:val="24"/>
+          <w:lang w:eastAsia="en-IN"/>
+        </w:rPr>
+        <w:t xml:space="preserve"> is prime </w:t>
       </w:r>
     </w:p>
     <w:p>
@@ -3549,7 +3800,27 @@
           <w:szCs w:val="24"/>
           <w:lang w:eastAsia="en-IN"/>
         </w:rPr>
-        <w:t xml:space="preserve">Replace digits where digit is local max (greater than neighbors) </w:t>
+        <w:t xml:space="preserve">Replace digits where digit is local max (greater than </w:t>
+      </w:r>
+      <w:proofErr w:type="spellStart"/>
+      <w:r>
+        <w:rPr>
+          <w:rFonts w:ascii="Times New Roman" w:eastAsia="Times New Roman" w:hAnsi="Times New Roman" w:cs="Times New Roman"/>
+          <w:sz w:val="24"/>
+          <w:szCs w:val="24"/>
+          <w:lang w:eastAsia="en-IN"/>
+        </w:rPr>
+        <w:t>neighbors</w:t>
+      </w:r>
+      <w:proofErr w:type="spellEnd"/>
+      <w:r>
+        <w:rPr>
+          <w:rFonts w:ascii="Times New Roman" w:eastAsia="Times New Roman" w:hAnsi="Times New Roman" w:cs="Times New Roman"/>
+          <w:sz w:val="24"/>
+          <w:szCs w:val="24"/>
+          <w:lang w:eastAsia="en-IN"/>
+        </w:rPr>
+        <w:t xml:space="preserve">) </w:t>
       </w:r>
     </w:p>
     <w:p>
@@ -3622,6 +3893,2339 @@
           <w:lang w:eastAsia="en-IN"/>
         </w:rPr>
         <w:t>Replace digits where digit participates in increasing sequence</w:t>
+      </w:r>
+    </w:p>
+    <w:p>
+      <w:pPr>
+        <w:spacing w:before="100" w:beforeAutospacing="1" w:after="100" w:afterAutospacing="1" w:line="240" w:lineRule="auto"/>
+        <w:outlineLvl w:val="0"/>
+        <w:rPr>
+          <w:rFonts w:ascii="Times New Roman" w:eastAsia="Times New Roman" w:hAnsi="Times New Roman" w:cs="Times New Roman"/>
+          <w:b/>
+          <w:bCs/>
+          <w:kern w:val="36"/>
+          <w:sz w:val="48"/>
+          <w:szCs w:val="48"/>
+          <w:lang w:eastAsia="en-IN"/>
+        </w:rPr>
+      </w:pPr>
+      <w:r>
+        <w:rPr>
+          <w:rFonts w:ascii="Segoe UI Emoji" w:eastAsia="Times New Roman" w:hAnsi="Segoe UI Emoji" w:cs="Segoe UI Emoji"/>
+          <w:b/>
+          <w:bCs/>
+          <w:kern w:val="36"/>
+          <w:sz w:val="48"/>
+          <w:szCs w:val="48"/>
+          <w:lang w:eastAsia="en-IN"/>
+        </w:rPr>
+        <w:lastRenderedPageBreak/>
+        <w:t>💀</w:t>
+      </w:r>
+      <w:r>
+        <w:rPr>
+          <w:rFonts w:ascii="Times New Roman" w:eastAsia="Times New Roman" w:hAnsi="Times New Roman" w:cs="Times New Roman"/>
+          <w:b/>
+          <w:bCs/>
+          <w:kern w:val="36"/>
+          <w:sz w:val="48"/>
+          <w:szCs w:val="48"/>
+          <w:lang w:eastAsia="en-IN"/>
+        </w:rPr>
+        <w:t xml:space="preserve"> ULTRA HARD SET (10 Questions)</w:t>
+      </w:r>
+    </w:p>
+    <w:p>
+      <w:pPr>
+        <w:spacing w:before="100" w:beforeAutospacing="1" w:after="100" w:afterAutospacing="1" w:line="240" w:lineRule="auto"/>
+        <w:rPr>
+          <w:rFonts w:ascii="Times New Roman" w:eastAsia="Times New Roman" w:hAnsi="Times New Roman" w:cs="Times New Roman"/>
+          <w:sz w:val="24"/>
+          <w:szCs w:val="24"/>
+          <w:lang w:eastAsia="en-IN"/>
+        </w:rPr>
+      </w:pPr>
+      <w:proofErr w:type="gramStart"/>
+      <w:r>
+        <w:rPr>
+          <w:rFonts w:ascii="Times New Roman" w:eastAsia="Times New Roman" w:hAnsi="Times New Roman" w:cs="Times New Roman"/>
+          <w:sz w:val="24"/>
+          <w:szCs w:val="24"/>
+          <w:lang w:eastAsia="en-IN"/>
+        </w:rPr>
+        <w:t>These combine</w:t>
+      </w:r>
+      <w:proofErr w:type="gramEnd"/>
+      <w:r>
+        <w:rPr>
+          <w:rFonts w:ascii="Times New Roman" w:eastAsia="Times New Roman" w:hAnsi="Times New Roman" w:cs="Times New Roman"/>
+          <w:sz w:val="24"/>
+          <w:szCs w:val="24"/>
+          <w:lang w:eastAsia="en-IN"/>
+        </w:rPr>
+        <w:t>:</w:t>
+      </w:r>
+      <w:r>
+        <w:rPr>
+          <w:rFonts w:ascii="Times New Roman" w:eastAsia="Times New Roman" w:hAnsi="Times New Roman" w:cs="Times New Roman"/>
+          <w:sz w:val="24"/>
+          <w:szCs w:val="24"/>
+          <w:lang w:eastAsia="en-IN"/>
+        </w:rPr>
+        <w:br/>
+      </w:r>
+      <w:r>
+        <w:rPr>
+          <w:rFonts w:ascii="Segoe UI Emoji" w:eastAsia="Times New Roman" w:hAnsi="Segoe UI Emoji" w:cs="Segoe UI Emoji"/>
+          <w:sz w:val="24"/>
+          <w:szCs w:val="24"/>
+          <w:lang w:eastAsia="en-IN"/>
+        </w:rPr>
+        <w:t>👉</w:t>
+      </w:r>
+      <w:r>
+        <w:rPr>
+          <w:rFonts w:ascii="Times New Roman" w:eastAsia="Times New Roman" w:hAnsi="Times New Roman" w:cs="Times New Roman"/>
+          <w:sz w:val="24"/>
+          <w:szCs w:val="24"/>
+          <w:lang w:eastAsia="en-IN"/>
+        </w:rPr>
+        <w:t xml:space="preserve"> frequency + position + running sum + conditions + edge cases</w:t>
+      </w:r>
+    </w:p>
+    <w:p>
+      <w:pPr>
+        <w:spacing w:after="0" w:line="240" w:lineRule="auto"/>
+        <w:rPr>
+          <w:rFonts w:ascii="Times New Roman" w:eastAsia="Times New Roman" w:hAnsi="Times New Roman" w:cs="Times New Roman"/>
+          <w:sz w:val="24"/>
+          <w:szCs w:val="24"/>
+          <w:lang w:eastAsia="en-IN"/>
+        </w:rPr>
+      </w:pPr>
+      <w:r>
+        <w:rPr>
+          <w:rFonts w:ascii="Times New Roman" w:eastAsia="Times New Roman" w:hAnsi="Times New Roman" w:cs="Times New Roman"/>
+          <w:sz w:val="24"/>
+          <w:szCs w:val="24"/>
+          <w:lang w:eastAsia="en-IN"/>
+        </w:rPr>
+        <w:pict w14:anchorId="74067C87">
+          <v:rect id="_x0000_i1039" style="width:0;height:1.5pt" o:hralign="center" o:hrstd="t" o:hr="t" fillcolor="#a0a0a0" stroked="f"/>
+        </w:pict>
+      </w:r>
+    </w:p>
+    <w:p>
+      <w:pPr>
+        <w:spacing w:before="100" w:beforeAutospacing="1" w:after="100" w:afterAutospacing="1" w:line="240" w:lineRule="auto"/>
+        <w:outlineLvl w:val="1"/>
+        <w:rPr>
+          <w:rFonts w:ascii="Times New Roman" w:eastAsia="Times New Roman" w:hAnsi="Times New Roman" w:cs="Times New Roman"/>
+          <w:b/>
+          <w:bCs/>
+          <w:sz w:val="36"/>
+          <w:szCs w:val="36"/>
+          <w:lang w:eastAsia="en-IN"/>
+        </w:rPr>
+      </w:pPr>
+      <w:r>
+        <w:rPr>
+          <w:rFonts w:ascii="Segoe UI Emoji" w:eastAsia="Times New Roman" w:hAnsi="Segoe UI Emoji" w:cs="Segoe UI Emoji"/>
+          <w:b/>
+          <w:bCs/>
+          <w:sz w:val="36"/>
+          <w:szCs w:val="36"/>
+          <w:lang w:eastAsia="en-IN"/>
+        </w:rPr>
+        <w:t>🧠</w:t>
+      </w:r>
+      <w:r>
+        <w:rPr>
+          <w:rFonts w:ascii="Times New Roman" w:eastAsia="Times New Roman" w:hAnsi="Times New Roman" w:cs="Times New Roman"/>
+          <w:b/>
+          <w:bCs/>
+          <w:sz w:val="36"/>
+          <w:szCs w:val="36"/>
+          <w:lang w:eastAsia="en-IN"/>
+        </w:rPr>
+        <w:t xml:space="preserve"> 1. (Multi-layer Prime Trap)</w:t>
+      </w:r>
+    </w:p>
+    <w:p>
+      <w:pPr>
+        <w:spacing w:before="100" w:beforeAutospacing="1" w:after="100" w:afterAutospacing="1" w:line="240" w:lineRule="auto"/>
+        <w:rPr>
+          <w:rFonts w:ascii="Times New Roman" w:eastAsia="Times New Roman" w:hAnsi="Times New Roman" w:cs="Times New Roman"/>
+          <w:sz w:val="24"/>
+          <w:szCs w:val="24"/>
+          <w:lang w:eastAsia="en-IN"/>
+        </w:rPr>
+      </w:pPr>
+      <w:r>
+        <w:rPr>
+          <w:rFonts w:ascii="Segoe UI Emoji" w:eastAsia="Times New Roman" w:hAnsi="Segoe UI Emoji" w:cs="Segoe UI Emoji"/>
+          <w:sz w:val="24"/>
+          <w:szCs w:val="24"/>
+          <w:lang w:eastAsia="en-IN"/>
+        </w:rPr>
+        <w:t>👉</w:t>
+      </w:r>
+      <w:r>
+        <w:rPr>
+          <w:rFonts w:ascii="Times New Roman" w:eastAsia="Times New Roman" w:hAnsi="Times New Roman" w:cs="Times New Roman"/>
+          <w:sz w:val="24"/>
+          <w:szCs w:val="24"/>
+          <w:lang w:eastAsia="en-IN"/>
+        </w:rPr>
+        <w:t xml:space="preserve"> Replace digit if:</w:t>
+      </w:r>
+    </w:p>
+    <w:p>
+      <w:pPr>
+        <w:tabs>
+          <w:tab w:val="left" w:pos="916"/>
+          <w:tab w:val="left" w:pos="1832"/>
+          <w:tab w:val="left" w:pos="2748"/>
+          <w:tab w:val="left" w:pos="3664"/>
+          <w:tab w:val="left" w:pos="4580"/>
+          <w:tab w:val="left" w:pos="5496"/>
+          <w:tab w:val="left" w:pos="6412"/>
+          <w:tab w:val="left" w:pos="7328"/>
+          <w:tab w:val="left" w:pos="8244"/>
+          <w:tab w:val="left" w:pos="9160"/>
+          <w:tab w:val="left" w:pos="10076"/>
+          <w:tab w:val="left" w:pos="10992"/>
+          <w:tab w:val="left" w:pos="11908"/>
+          <w:tab w:val="left" w:pos="12824"/>
+          <w:tab w:val="left" w:pos="13740"/>
+          <w:tab w:val="left" w:pos="14656"/>
+        </w:tabs>
+        <w:spacing w:after="0" w:line="240" w:lineRule="auto"/>
+        <w:rPr>
+          <w:rFonts w:ascii="Courier New" w:eastAsia="Times New Roman" w:hAnsi="Courier New" w:cs="Courier New"/>
+          <w:sz w:val="20"/>
+          <w:lang w:eastAsia="en-IN"/>
+        </w:rPr>
+      </w:pPr>
+      <w:r>
+        <w:rPr>
+          <w:rFonts w:ascii="Courier New" w:eastAsia="Times New Roman" w:hAnsi="Courier New" w:cs="Courier New"/>
+          <w:sz w:val="20"/>
+          <w:lang w:eastAsia="en-IN"/>
+        </w:rPr>
+        <w:t>digit² + frequency + running sum is prime</w:t>
+      </w:r>
+    </w:p>
+    <w:p>
+      <w:pPr>
+        <w:spacing w:before="100" w:beforeAutospacing="1" w:after="100" w:afterAutospacing="1" w:line="240" w:lineRule="auto"/>
+        <w:rPr>
+          <w:rFonts w:ascii="Times New Roman" w:eastAsia="Times New Roman" w:hAnsi="Times New Roman" w:cs="Times New Roman"/>
+          <w:sz w:val="24"/>
+          <w:szCs w:val="24"/>
+          <w:lang w:eastAsia="en-IN"/>
+        </w:rPr>
+      </w:pPr>
+      <w:r>
+        <w:rPr>
+          <w:rFonts w:ascii="Times New Roman" w:eastAsia="Times New Roman" w:hAnsi="Times New Roman" w:cs="Times New Roman"/>
+          <w:sz w:val="24"/>
+          <w:szCs w:val="24"/>
+          <w:lang w:eastAsia="en-IN"/>
+        </w:rPr>
+        <w:t>Else if:</w:t>
+      </w:r>
+    </w:p>
+    <w:p>
+      <w:pPr>
+        <w:tabs>
+          <w:tab w:val="left" w:pos="916"/>
+          <w:tab w:val="left" w:pos="1832"/>
+          <w:tab w:val="left" w:pos="2748"/>
+          <w:tab w:val="left" w:pos="3664"/>
+          <w:tab w:val="left" w:pos="4580"/>
+          <w:tab w:val="left" w:pos="5496"/>
+          <w:tab w:val="left" w:pos="6412"/>
+          <w:tab w:val="left" w:pos="7328"/>
+          <w:tab w:val="left" w:pos="8244"/>
+          <w:tab w:val="left" w:pos="9160"/>
+          <w:tab w:val="left" w:pos="10076"/>
+          <w:tab w:val="left" w:pos="10992"/>
+          <w:tab w:val="left" w:pos="11908"/>
+          <w:tab w:val="left" w:pos="12824"/>
+          <w:tab w:val="left" w:pos="13740"/>
+          <w:tab w:val="left" w:pos="14656"/>
+        </w:tabs>
+        <w:spacing w:after="0" w:line="240" w:lineRule="auto"/>
+        <w:rPr>
+          <w:rFonts w:ascii="Courier New" w:eastAsia="Times New Roman" w:hAnsi="Courier New" w:cs="Courier New"/>
+          <w:sz w:val="20"/>
+          <w:lang w:eastAsia="en-IN"/>
+        </w:rPr>
+      </w:pPr>
+      <w:r>
+        <w:rPr>
+          <w:rFonts w:ascii="Courier New" w:eastAsia="Times New Roman" w:hAnsi="Courier New" w:cs="Courier New"/>
+          <w:sz w:val="20"/>
+          <w:lang w:eastAsia="en-IN"/>
+        </w:rPr>
+        <w:t>value is divisible by 3 → replace with 3</w:t>
+      </w:r>
+    </w:p>
+    <w:p>
+      <w:pPr>
+        <w:spacing w:before="100" w:beforeAutospacing="1" w:after="100" w:afterAutospacing="1" w:line="240" w:lineRule="auto"/>
+        <w:rPr>
+          <w:rFonts w:ascii="Times New Roman" w:eastAsia="Times New Roman" w:hAnsi="Times New Roman" w:cs="Times New Roman"/>
+          <w:sz w:val="24"/>
+          <w:szCs w:val="24"/>
+          <w:lang w:eastAsia="en-IN"/>
+        </w:rPr>
+      </w:pPr>
+      <w:r>
+        <w:rPr>
+          <w:rFonts w:ascii="Times New Roman" w:eastAsia="Times New Roman" w:hAnsi="Times New Roman" w:cs="Times New Roman"/>
+          <w:sz w:val="24"/>
+          <w:szCs w:val="24"/>
+          <w:lang w:eastAsia="en-IN"/>
+        </w:rPr>
+        <w:t>Else keep same</w:t>
+      </w:r>
+    </w:p>
+    <w:p>
+      <w:pPr>
+        <w:spacing w:after="0" w:line="240" w:lineRule="auto"/>
+        <w:rPr>
+          <w:rFonts w:ascii="Times New Roman" w:eastAsia="Times New Roman" w:hAnsi="Times New Roman" w:cs="Times New Roman"/>
+          <w:sz w:val="24"/>
+          <w:szCs w:val="24"/>
+          <w:lang w:eastAsia="en-IN"/>
+        </w:rPr>
+      </w:pPr>
+      <w:r>
+        <w:rPr>
+          <w:rFonts w:ascii="Times New Roman" w:eastAsia="Times New Roman" w:hAnsi="Times New Roman" w:cs="Times New Roman"/>
+          <w:sz w:val="24"/>
+          <w:szCs w:val="24"/>
+          <w:lang w:eastAsia="en-IN"/>
+        </w:rPr>
+        <w:pict w14:anchorId="37E44776">
+          <v:rect id="_x0000_i1040" style="width:0;height:1.5pt" o:hralign="center" o:hrstd="t" o:hr="t" fillcolor="#a0a0a0" stroked="f"/>
+        </w:pict>
+      </w:r>
+    </w:p>
+    <w:p>
+      <w:pPr>
+        <w:spacing w:before="100" w:beforeAutospacing="1" w:after="100" w:afterAutospacing="1" w:line="240" w:lineRule="auto"/>
+        <w:outlineLvl w:val="1"/>
+        <w:rPr>
+          <w:rFonts w:ascii="Times New Roman" w:eastAsia="Times New Roman" w:hAnsi="Times New Roman" w:cs="Times New Roman"/>
+          <w:b/>
+          <w:bCs/>
+          <w:sz w:val="36"/>
+          <w:szCs w:val="36"/>
+          <w:lang w:eastAsia="en-IN"/>
+        </w:rPr>
+      </w:pPr>
+      <w:r>
+        <w:rPr>
+          <w:rFonts w:ascii="Segoe UI Emoji" w:eastAsia="Times New Roman" w:hAnsi="Segoe UI Emoji" w:cs="Segoe UI Emoji"/>
+          <w:b/>
+          <w:bCs/>
+          <w:sz w:val="36"/>
+          <w:szCs w:val="36"/>
+          <w:lang w:eastAsia="en-IN"/>
+        </w:rPr>
+        <w:t>🧠</w:t>
+      </w:r>
+      <w:r>
+        <w:rPr>
+          <w:rFonts w:ascii="Times New Roman" w:eastAsia="Times New Roman" w:hAnsi="Times New Roman" w:cs="Times New Roman"/>
+          <w:b/>
+          <w:bCs/>
+          <w:sz w:val="36"/>
+          <w:szCs w:val="36"/>
+          <w:lang w:eastAsia="en-IN"/>
+        </w:rPr>
+        <w:t xml:space="preserve"> 2. (Dual Running Logic)</w:t>
+      </w:r>
+    </w:p>
+    <w:p>
+      <w:pPr>
+        <w:spacing w:before="100" w:beforeAutospacing="1" w:after="100" w:afterAutospacing="1" w:line="240" w:lineRule="auto"/>
+        <w:rPr>
+          <w:rFonts w:ascii="Times New Roman" w:eastAsia="Times New Roman" w:hAnsi="Times New Roman" w:cs="Times New Roman"/>
+          <w:sz w:val="24"/>
+          <w:szCs w:val="24"/>
+          <w:lang w:eastAsia="en-IN"/>
+        </w:rPr>
+      </w:pPr>
+      <w:r>
+        <w:rPr>
+          <w:rFonts w:ascii="Segoe UI Emoji" w:eastAsia="Times New Roman" w:hAnsi="Segoe UI Emoji" w:cs="Segoe UI Emoji"/>
+          <w:sz w:val="24"/>
+          <w:szCs w:val="24"/>
+          <w:lang w:eastAsia="en-IN"/>
+        </w:rPr>
+        <w:t>👉</w:t>
+      </w:r>
+      <w:r>
+        <w:rPr>
+          <w:rFonts w:ascii="Times New Roman" w:eastAsia="Times New Roman" w:hAnsi="Times New Roman" w:cs="Times New Roman"/>
+          <w:sz w:val="24"/>
+          <w:szCs w:val="24"/>
+          <w:lang w:eastAsia="en-IN"/>
+        </w:rPr>
+        <w:t xml:space="preserve"> Replace digit if:</w:t>
+      </w:r>
+    </w:p>
+    <w:p>
+      <w:pPr>
+        <w:tabs>
+          <w:tab w:val="left" w:pos="916"/>
+          <w:tab w:val="left" w:pos="1832"/>
+          <w:tab w:val="left" w:pos="2748"/>
+          <w:tab w:val="left" w:pos="3664"/>
+          <w:tab w:val="left" w:pos="4580"/>
+          <w:tab w:val="left" w:pos="5496"/>
+          <w:tab w:val="left" w:pos="6412"/>
+          <w:tab w:val="left" w:pos="7328"/>
+          <w:tab w:val="left" w:pos="8244"/>
+          <w:tab w:val="left" w:pos="9160"/>
+          <w:tab w:val="left" w:pos="10076"/>
+          <w:tab w:val="left" w:pos="10992"/>
+          <w:tab w:val="left" w:pos="11908"/>
+          <w:tab w:val="left" w:pos="12824"/>
+          <w:tab w:val="left" w:pos="13740"/>
+          <w:tab w:val="left" w:pos="14656"/>
+        </w:tabs>
+        <w:spacing w:after="0" w:line="240" w:lineRule="auto"/>
+        <w:rPr>
+          <w:rFonts w:ascii="Courier New" w:eastAsia="Times New Roman" w:hAnsi="Courier New" w:cs="Courier New"/>
+          <w:sz w:val="20"/>
+          <w:lang w:eastAsia="en-IN"/>
+        </w:rPr>
+      </w:pPr>
+      <w:r>
+        <w:rPr>
+          <w:rFonts w:ascii="Courier New" w:eastAsia="Times New Roman" w:hAnsi="Courier New" w:cs="Courier New"/>
+          <w:sz w:val="20"/>
+          <w:lang w:eastAsia="en-IN"/>
+        </w:rPr>
+        <w:t>(</w:t>
+      </w:r>
+      <w:proofErr w:type="gramStart"/>
+      <w:r>
+        <w:rPr>
+          <w:rFonts w:ascii="Courier New" w:eastAsia="Times New Roman" w:hAnsi="Courier New" w:cs="Courier New"/>
+          <w:sz w:val="20"/>
+          <w:lang w:eastAsia="en-IN"/>
+        </w:rPr>
+        <w:t>running</w:t>
+      </w:r>
+      <w:proofErr w:type="gramEnd"/>
+      <w:r>
+        <w:rPr>
+          <w:rFonts w:ascii="Courier New" w:eastAsia="Times New Roman" w:hAnsi="Courier New" w:cs="Courier New"/>
+          <w:sz w:val="20"/>
+          <w:lang w:eastAsia="en-IN"/>
+        </w:rPr>
+        <w:t xml:space="preserve"> sum × digit) is even</w:t>
+      </w:r>
+    </w:p>
+    <w:p>
+      <w:pPr>
+        <w:spacing w:before="100" w:beforeAutospacing="1" w:after="100" w:afterAutospacing="1" w:line="240" w:lineRule="auto"/>
+        <w:rPr>
+          <w:rFonts w:ascii="Times New Roman" w:eastAsia="Times New Roman" w:hAnsi="Times New Roman" w:cs="Times New Roman"/>
+          <w:sz w:val="24"/>
+          <w:szCs w:val="24"/>
+          <w:lang w:eastAsia="en-IN"/>
+        </w:rPr>
+      </w:pPr>
+      <w:r>
+        <w:rPr>
+          <w:rFonts w:ascii="Times New Roman" w:eastAsia="Times New Roman" w:hAnsi="Times New Roman" w:cs="Times New Roman"/>
+          <w:sz w:val="24"/>
+          <w:szCs w:val="24"/>
+          <w:lang w:eastAsia="en-IN"/>
+        </w:rPr>
+        <w:t>AND</w:t>
+      </w:r>
+    </w:p>
+    <w:p>
+      <w:pPr>
+        <w:tabs>
+          <w:tab w:val="left" w:pos="916"/>
+          <w:tab w:val="left" w:pos="1832"/>
+          <w:tab w:val="left" w:pos="2748"/>
+          <w:tab w:val="left" w:pos="3664"/>
+          <w:tab w:val="left" w:pos="4580"/>
+          <w:tab w:val="left" w:pos="5496"/>
+          <w:tab w:val="left" w:pos="6412"/>
+          <w:tab w:val="left" w:pos="7328"/>
+          <w:tab w:val="left" w:pos="8244"/>
+          <w:tab w:val="left" w:pos="9160"/>
+          <w:tab w:val="left" w:pos="10076"/>
+          <w:tab w:val="left" w:pos="10992"/>
+          <w:tab w:val="left" w:pos="11908"/>
+          <w:tab w:val="left" w:pos="12824"/>
+          <w:tab w:val="left" w:pos="13740"/>
+          <w:tab w:val="left" w:pos="14656"/>
+        </w:tabs>
+        <w:spacing w:after="0" w:line="240" w:lineRule="auto"/>
+        <w:rPr>
+          <w:rFonts w:ascii="Courier New" w:eastAsia="Times New Roman" w:hAnsi="Courier New" w:cs="Courier New"/>
+          <w:sz w:val="20"/>
+          <w:lang w:eastAsia="en-IN"/>
+        </w:rPr>
+      </w:pPr>
+      <w:r>
+        <w:rPr>
+          <w:rFonts w:ascii="Courier New" w:eastAsia="Times New Roman" w:hAnsi="Courier New" w:cs="Courier New"/>
+          <w:sz w:val="20"/>
+          <w:lang w:eastAsia="en-IN"/>
+        </w:rPr>
+        <w:t>frequency of digit is odd</w:t>
+      </w:r>
+    </w:p>
+    <w:p>
+      <w:pPr>
+        <w:spacing w:after="0" w:line="240" w:lineRule="auto"/>
+        <w:rPr>
+          <w:rFonts w:ascii="Times New Roman" w:eastAsia="Times New Roman" w:hAnsi="Times New Roman" w:cs="Times New Roman"/>
+          <w:sz w:val="24"/>
+          <w:szCs w:val="24"/>
+          <w:lang w:eastAsia="en-IN"/>
+        </w:rPr>
+      </w:pPr>
+      <w:r>
+        <w:rPr>
+          <w:rFonts w:ascii="Times New Roman" w:eastAsia="Times New Roman" w:hAnsi="Times New Roman" w:cs="Times New Roman"/>
+          <w:sz w:val="24"/>
+          <w:szCs w:val="24"/>
+          <w:lang w:eastAsia="en-IN"/>
+        </w:rPr>
+        <w:pict w14:anchorId="4B96514F">
+          <v:rect id="_x0000_i1041" style="width:0;height:1.5pt" o:hralign="center" o:hrstd="t" o:hr="t" fillcolor="#a0a0a0" stroked="f"/>
+        </w:pict>
+      </w:r>
+    </w:p>
+    <w:p>
+      <w:pPr>
+        <w:spacing w:before="100" w:beforeAutospacing="1" w:after="100" w:afterAutospacing="1" w:line="240" w:lineRule="auto"/>
+        <w:outlineLvl w:val="1"/>
+        <w:rPr>
+          <w:rFonts w:ascii="Times New Roman" w:eastAsia="Times New Roman" w:hAnsi="Times New Roman" w:cs="Times New Roman"/>
+          <w:b/>
+          <w:bCs/>
+          <w:sz w:val="36"/>
+          <w:szCs w:val="36"/>
+          <w:lang w:eastAsia="en-IN"/>
+        </w:rPr>
+      </w:pPr>
+      <w:r>
+        <w:rPr>
+          <w:rFonts w:ascii="Segoe UI Emoji" w:eastAsia="Times New Roman" w:hAnsi="Segoe UI Emoji" w:cs="Segoe UI Emoji"/>
+          <w:b/>
+          <w:bCs/>
+          <w:sz w:val="36"/>
+          <w:szCs w:val="36"/>
+          <w:lang w:eastAsia="en-IN"/>
+        </w:rPr>
+        <w:t>🧠</w:t>
+      </w:r>
+      <w:r>
+        <w:rPr>
+          <w:rFonts w:ascii="Times New Roman" w:eastAsia="Times New Roman" w:hAnsi="Times New Roman" w:cs="Times New Roman"/>
+          <w:b/>
+          <w:bCs/>
+          <w:sz w:val="36"/>
+          <w:szCs w:val="36"/>
+          <w:lang w:eastAsia="en-IN"/>
+        </w:rPr>
+        <w:t xml:space="preserve"> 3. (Position + Frequency Clash)</w:t>
+      </w:r>
+    </w:p>
+    <w:p>
+      <w:pPr>
+        <w:spacing w:before="100" w:beforeAutospacing="1" w:after="100" w:afterAutospacing="1" w:line="240" w:lineRule="auto"/>
+        <w:rPr>
+          <w:rFonts w:ascii="Times New Roman" w:eastAsia="Times New Roman" w:hAnsi="Times New Roman" w:cs="Times New Roman"/>
+          <w:sz w:val="24"/>
+          <w:szCs w:val="24"/>
+          <w:lang w:eastAsia="en-IN"/>
+        </w:rPr>
+      </w:pPr>
+      <w:r>
+        <w:rPr>
+          <w:rFonts w:ascii="Segoe UI Emoji" w:eastAsia="Times New Roman" w:hAnsi="Segoe UI Emoji" w:cs="Segoe UI Emoji"/>
+          <w:sz w:val="24"/>
+          <w:szCs w:val="24"/>
+          <w:lang w:eastAsia="en-IN"/>
+        </w:rPr>
+        <w:t>👉</w:t>
+      </w:r>
+      <w:r>
+        <w:rPr>
+          <w:rFonts w:ascii="Times New Roman" w:eastAsia="Times New Roman" w:hAnsi="Times New Roman" w:cs="Times New Roman"/>
+          <w:sz w:val="24"/>
+          <w:szCs w:val="24"/>
+          <w:lang w:eastAsia="en-IN"/>
+        </w:rPr>
+        <w:t xml:space="preserve"> Replace digit if:</w:t>
+      </w:r>
+    </w:p>
+    <w:p>
+      <w:pPr>
+        <w:tabs>
+          <w:tab w:val="left" w:pos="916"/>
+          <w:tab w:val="left" w:pos="1832"/>
+          <w:tab w:val="left" w:pos="2748"/>
+          <w:tab w:val="left" w:pos="3664"/>
+          <w:tab w:val="left" w:pos="4580"/>
+          <w:tab w:val="left" w:pos="5496"/>
+          <w:tab w:val="left" w:pos="6412"/>
+          <w:tab w:val="left" w:pos="7328"/>
+          <w:tab w:val="left" w:pos="8244"/>
+          <w:tab w:val="left" w:pos="9160"/>
+          <w:tab w:val="left" w:pos="10076"/>
+          <w:tab w:val="left" w:pos="10992"/>
+          <w:tab w:val="left" w:pos="11908"/>
+          <w:tab w:val="left" w:pos="12824"/>
+          <w:tab w:val="left" w:pos="13740"/>
+          <w:tab w:val="left" w:pos="14656"/>
+        </w:tabs>
+        <w:spacing w:after="0" w:line="240" w:lineRule="auto"/>
+        <w:rPr>
+          <w:rFonts w:ascii="Courier New" w:eastAsia="Times New Roman" w:hAnsi="Courier New" w:cs="Courier New"/>
+          <w:sz w:val="20"/>
+          <w:lang w:eastAsia="en-IN"/>
+        </w:rPr>
+      </w:pPr>
+      <w:r>
+        <w:rPr>
+          <w:rFonts w:ascii="Courier New" w:eastAsia="Times New Roman" w:hAnsi="Courier New" w:cs="Courier New"/>
+          <w:sz w:val="20"/>
+          <w:lang w:eastAsia="en-IN"/>
+        </w:rPr>
+        <w:t>digit + position == frequency</w:t>
+      </w:r>
+    </w:p>
+    <w:p>
+      <w:pPr>
+        <w:spacing w:before="100" w:beforeAutospacing="1" w:after="100" w:afterAutospacing="1" w:line="240" w:lineRule="auto"/>
+        <w:rPr>
+          <w:rFonts w:ascii="Times New Roman" w:eastAsia="Times New Roman" w:hAnsi="Times New Roman" w:cs="Times New Roman"/>
+          <w:sz w:val="24"/>
+          <w:szCs w:val="24"/>
+          <w:lang w:eastAsia="en-IN"/>
+        </w:rPr>
+      </w:pPr>
+      <w:r>
+        <w:rPr>
+          <w:rFonts w:ascii="Times New Roman" w:eastAsia="Times New Roman" w:hAnsi="Times New Roman" w:cs="Times New Roman"/>
+          <w:sz w:val="24"/>
+          <w:szCs w:val="24"/>
+          <w:lang w:eastAsia="en-IN"/>
+        </w:rPr>
+        <w:t>Else if:</w:t>
+      </w:r>
+    </w:p>
+    <w:p>
+      <w:pPr>
+        <w:tabs>
+          <w:tab w:val="left" w:pos="916"/>
+          <w:tab w:val="left" w:pos="1832"/>
+          <w:tab w:val="left" w:pos="2748"/>
+          <w:tab w:val="left" w:pos="3664"/>
+          <w:tab w:val="left" w:pos="4580"/>
+          <w:tab w:val="left" w:pos="5496"/>
+          <w:tab w:val="left" w:pos="6412"/>
+          <w:tab w:val="left" w:pos="7328"/>
+          <w:tab w:val="left" w:pos="8244"/>
+          <w:tab w:val="left" w:pos="9160"/>
+          <w:tab w:val="left" w:pos="10076"/>
+          <w:tab w:val="left" w:pos="10992"/>
+          <w:tab w:val="left" w:pos="11908"/>
+          <w:tab w:val="left" w:pos="12824"/>
+          <w:tab w:val="left" w:pos="13740"/>
+          <w:tab w:val="left" w:pos="14656"/>
+        </w:tabs>
+        <w:spacing w:after="0" w:line="240" w:lineRule="auto"/>
+        <w:rPr>
+          <w:rFonts w:ascii="Courier New" w:eastAsia="Times New Roman" w:hAnsi="Courier New" w:cs="Courier New"/>
+          <w:sz w:val="20"/>
+          <w:lang w:eastAsia="en-IN"/>
+        </w:rPr>
+      </w:pPr>
+      <w:r>
+        <w:rPr>
+          <w:rFonts w:ascii="Courier New" w:eastAsia="Times New Roman" w:hAnsi="Courier New" w:cs="Courier New"/>
+          <w:sz w:val="20"/>
+          <w:lang w:eastAsia="en-IN"/>
+        </w:rPr>
+        <w:t>digit × position is prime</w:t>
+      </w:r>
+    </w:p>
+    <w:p>
+      <w:pPr>
+        <w:spacing w:after="0" w:line="240" w:lineRule="auto"/>
+        <w:rPr>
+          <w:rFonts w:ascii="Times New Roman" w:eastAsia="Times New Roman" w:hAnsi="Times New Roman" w:cs="Times New Roman"/>
+          <w:sz w:val="24"/>
+          <w:szCs w:val="24"/>
+          <w:lang w:eastAsia="en-IN"/>
+        </w:rPr>
+      </w:pPr>
+      <w:r>
+        <w:rPr>
+          <w:rFonts w:ascii="Times New Roman" w:eastAsia="Times New Roman" w:hAnsi="Times New Roman" w:cs="Times New Roman"/>
+          <w:sz w:val="24"/>
+          <w:szCs w:val="24"/>
+          <w:lang w:eastAsia="en-IN"/>
+        </w:rPr>
+        <w:pict w14:anchorId="60BA1C90">
+          <v:rect id="_x0000_i1042" style="width:0;height:1.5pt" o:hralign="center" o:hrstd="t" o:hr="t" fillcolor="#a0a0a0" stroked="f"/>
+        </w:pict>
+      </w:r>
+    </w:p>
+    <w:p>
+      <w:pPr>
+        <w:spacing w:before="100" w:beforeAutospacing="1" w:after="100" w:afterAutospacing="1" w:line="240" w:lineRule="auto"/>
+        <w:outlineLvl w:val="1"/>
+        <w:rPr>
+          <w:rFonts w:ascii="Times New Roman" w:eastAsia="Times New Roman" w:hAnsi="Times New Roman" w:cs="Times New Roman"/>
+          <w:b/>
+          <w:bCs/>
+          <w:sz w:val="36"/>
+          <w:szCs w:val="36"/>
+          <w:lang w:eastAsia="en-IN"/>
+        </w:rPr>
+      </w:pPr>
+      <w:r>
+        <w:rPr>
+          <w:rFonts w:ascii="Segoe UI Emoji" w:eastAsia="Times New Roman" w:hAnsi="Segoe UI Emoji" w:cs="Segoe UI Emoji"/>
+          <w:b/>
+          <w:bCs/>
+          <w:sz w:val="36"/>
+          <w:szCs w:val="36"/>
+          <w:lang w:eastAsia="en-IN"/>
+        </w:rPr>
+        <w:t>🧠</w:t>
+      </w:r>
+      <w:r>
+        <w:rPr>
+          <w:rFonts w:ascii="Times New Roman" w:eastAsia="Times New Roman" w:hAnsi="Times New Roman" w:cs="Times New Roman"/>
+          <w:b/>
+          <w:bCs/>
+          <w:sz w:val="36"/>
+          <w:szCs w:val="36"/>
+          <w:lang w:eastAsia="en-IN"/>
+        </w:rPr>
+        <w:t xml:space="preserve"> 4. (Mirror Logic)</w:t>
+      </w:r>
+    </w:p>
+    <w:p>
+      <w:pPr>
+        <w:spacing w:before="100" w:beforeAutospacing="1" w:after="100" w:afterAutospacing="1" w:line="240" w:lineRule="auto"/>
+        <w:rPr>
+          <w:rFonts w:ascii="Times New Roman" w:eastAsia="Times New Roman" w:hAnsi="Times New Roman" w:cs="Times New Roman"/>
+          <w:sz w:val="24"/>
+          <w:szCs w:val="24"/>
+          <w:lang w:eastAsia="en-IN"/>
+        </w:rPr>
+      </w:pPr>
+      <w:r>
+        <w:rPr>
+          <w:rFonts w:ascii="Segoe UI Emoji" w:eastAsia="Times New Roman" w:hAnsi="Segoe UI Emoji" w:cs="Segoe UI Emoji"/>
+          <w:sz w:val="24"/>
+          <w:szCs w:val="24"/>
+          <w:lang w:eastAsia="en-IN"/>
+        </w:rPr>
+        <w:t>👉</w:t>
+      </w:r>
+      <w:r>
+        <w:rPr>
+          <w:rFonts w:ascii="Times New Roman" w:eastAsia="Times New Roman" w:hAnsi="Times New Roman" w:cs="Times New Roman"/>
+          <w:sz w:val="24"/>
+          <w:szCs w:val="24"/>
+          <w:lang w:eastAsia="en-IN"/>
+        </w:rPr>
+        <w:t xml:space="preserve"> Replace digit if:</w:t>
+      </w:r>
+    </w:p>
+    <w:p>
+      <w:pPr>
+        <w:tabs>
+          <w:tab w:val="left" w:pos="916"/>
+          <w:tab w:val="left" w:pos="1832"/>
+          <w:tab w:val="left" w:pos="2748"/>
+          <w:tab w:val="left" w:pos="3664"/>
+          <w:tab w:val="left" w:pos="4580"/>
+          <w:tab w:val="left" w:pos="5496"/>
+          <w:tab w:val="left" w:pos="6412"/>
+          <w:tab w:val="left" w:pos="7328"/>
+          <w:tab w:val="left" w:pos="8244"/>
+          <w:tab w:val="left" w:pos="9160"/>
+          <w:tab w:val="left" w:pos="10076"/>
+          <w:tab w:val="left" w:pos="10992"/>
+          <w:tab w:val="left" w:pos="11908"/>
+          <w:tab w:val="left" w:pos="12824"/>
+          <w:tab w:val="left" w:pos="13740"/>
+          <w:tab w:val="left" w:pos="14656"/>
+        </w:tabs>
+        <w:spacing w:after="0" w:line="240" w:lineRule="auto"/>
+        <w:rPr>
+          <w:rFonts w:ascii="Courier New" w:eastAsia="Times New Roman" w:hAnsi="Courier New" w:cs="Courier New"/>
+          <w:sz w:val="20"/>
+          <w:lang w:eastAsia="en-IN"/>
+        </w:rPr>
+      </w:pPr>
+      <w:r>
+        <w:rPr>
+          <w:rFonts w:ascii="Courier New" w:eastAsia="Times New Roman" w:hAnsi="Courier New" w:cs="Courier New"/>
+          <w:sz w:val="20"/>
+          <w:lang w:eastAsia="en-IN"/>
+        </w:rPr>
+        <w:lastRenderedPageBreak/>
+        <w:t>digit == its mirror position digit</w:t>
+      </w:r>
+    </w:p>
+    <w:p>
+      <w:pPr>
+        <w:spacing w:before="100" w:beforeAutospacing="1" w:after="100" w:afterAutospacing="1" w:line="240" w:lineRule="auto"/>
+        <w:rPr>
+          <w:rFonts w:ascii="Times New Roman" w:eastAsia="Times New Roman" w:hAnsi="Times New Roman" w:cs="Times New Roman"/>
+          <w:sz w:val="24"/>
+          <w:szCs w:val="24"/>
+          <w:lang w:eastAsia="en-IN"/>
+        </w:rPr>
+      </w:pPr>
+      <w:r>
+        <w:rPr>
+          <w:rFonts w:ascii="Times New Roman" w:eastAsia="Times New Roman" w:hAnsi="Times New Roman" w:cs="Times New Roman"/>
+          <w:sz w:val="24"/>
+          <w:szCs w:val="24"/>
+          <w:lang w:eastAsia="en-IN"/>
+        </w:rPr>
+        <w:t>AND:</w:t>
+      </w:r>
+    </w:p>
+    <w:p>
+      <w:pPr>
+        <w:tabs>
+          <w:tab w:val="left" w:pos="916"/>
+          <w:tab w:val="left" w:pos="1832"/>
+          <w:tab w:val="left" w:pos="2748"/>
+          <w:tab w:val="left" w:pos="3664"/>
+          <w:tab w:val="left" w:pos="4580"/>
+          <w:tab w:val="left" w:pos="5496"/>
+          <w:tab w:val="left" w:pos="6412"/>
+          <w:tab w:val="left" w:pos="7328"/>
+          <w:tab w:val="left" w:pos="8244"/>
+          <w:tab w:val="left" w:pos="9160"/>
+          <w:tab w:val="left" w:pos="10076"/>
+          <w:tab w:val="left" w:pos="10992"/>
+          <w:tab w:val="left" w:pos="11908"/>
+          <w:tab w:val="left" w:pos="12824"/>
+          <w:tab w:val="left" w:pos="13740"/>
+          <w:tab w:val="left" w:pos="14656"/>
+        </w:tabs>
+        <w:spacing w:after="0" w:line="240" w:lineRule="auto"/>
+        <w:rPr>
+          <w:rFonts w:ascii="Courier New" w:eastAsia="Times New Roman" w:hAnsi="Courier New" w:cs="Courier New"/>
+          <w:sz w:val="20"/>
+          <w:lang w:eastAsia="en-IN"/>
+        </w:rPr>
+      </w:pPr>
+      <w:r>
+        <w:rPr>
+          <w:rFonts w:ascii="Courier New" w:eastAsia="Times New Roman" w:hAnsi="Courier New" w:cs="Courier New"/>
+          <w:sz w:val="20"/>
+          <w:lang w:eastAsia="en-IN"/>
+        </w:rPr>
+        <w:t>their sum is prime</w:t>
+      </w:r>
+    </w:p>
+    <w:p>
+      <w:pPr>
+        <w:spacing w:after="0" w:line="240" w:lineRule="auto"/>
+        <w:rPr>
+          <w:rFonts w:ascii="Times New Roman" w:eastAsia="Times New Roman" w:hAnsi="Times New Roman" w:cs="Times New Roman"/>
+          <w:sz w:val="24"/>
+          <w:szCs w:val="24"/>
+          <w:lang w:eastAsia="en-IN"/>
+        </w:rPr>
+      </w:pPr>
+      <w:r>
+        <w:rPr>
+          <w:rFonts w:ascii="Times New Roman" w:eastAsia="Times New Roman" w:hAnsi="Times New Roman" w:cs="Times New Roman"/>
+          <w:sz w:val="24"/>
+          <w:szCs w:val="24"/>
+          <w:lang w:eastAsia="en-IN"/>
+        </w:rPr>
+        <w:pict w14:anchorId="5EE6AA7C">
+          <v:rect id="_x0000_i1043" style="width:0;height:1.5pt" o:hralign="center" o:hrstd="t" o:hr="t" fillcolor="#a0a0a0" stroked="f"/>
+        </w:pict>
+      </w:r>
+    </w:p>
+    <w:p>
+      <w:pPr>
+        <w:spacing w:before="100" w:beforeAutospacing="1" w:after="100" w:afterAutospacing="1" w:line="240" w:lineRule="auto"/>
+        <w:outlineLvl w:val="1"/>
+        <w:rPr>
+          <w:rFonts w:ascii="Times New Roman" w:eastAsia="Times New Roman" w:hAnsi="Times New Roman" w:cs="Times New Roman"/>
+          <w:b/>
+          <w:bCs/>
+          <w:sz w:val="36"/>
+          <w:szCs w:val="36"/>
+          <w:lang w:eastAsia="en-IN"/>
+        </w:rPr>
+      </w:pPr>
+      <w:r>
+        <w:rPr>
+          <w:rFonts w:ascii="Segoe UI Emoji" w:eastAsia="Times New Roman" w:hAnsi="Segoe UI Emoji" w:cs="Segoe UI Emoji"/>
+          <w:b/>
+          <w:bCs/>
+          <w:sz w:val="36"/>
+          <w:szCs w:val="36"/>
+          <w:lang w:eastAsia="en-IN"/>
+        </w:rPr>
+        <w:t>🧠</w:t>
+      </w:r>
+      <w:r>
+        <w:rPr>
+          <w:rFonts w:ascii="Times New Roman" w:eastAsia="Times New Roman" w:hAnsi="Times New Roman" w:cs="Times New Roman"/>
+          <w:b/>
+          <w:bCs/>
+          <w:sz w:val="36"/>
+          <w:szCs w:val="36"/>
+          <w:lang w:eastAsia="en-IN"/>
+        </w:rPr>
+        <w:t xml:space="preserve"> 5. (Running Average Trap)</w:t>
+      </w:r>
+    </w:p>
+    <w:p>
+      <w:pPr>
+        <w:spacing w:before="100" w:beforeAutospacing="1" w:after="100" w:afterAutospacing="1" w:line="240" w:lineRule="auto"/>
+        <w:rPr>
+          <w:rFonts w:ascii="Times New Roman" w:eastAsia="Times New Roman" w:hAnsi="Times New Roman" w:cs="Times New Roman"/>
+          <w:sz w:val="24"/>
+          <w:szCs w:val="24"/>
+          <w:lang w:eastAsia="en-IN"/>
+        </w:rPr>
+      </w:pPr>
+      <w:r>
+        <w:rPr>
+          <w:rFonts w:ascii="Segoe UI Emoji" w:eastAsia="Times New Roman" w:hAnsi="Segoe UI Emoji" w:cs="Segoe UI Emoji"/>
+          <w:sz w:val="24"/>
+          <w:szCs w:val="24"/>
+          <w:lang w:eastAsia="en-IN"/>
+        </w:rPr>
+        <w:t>👉</w:t>
+      </w:r>
+      <w:r>
+        <w:rPr>
+          <w:rFonts w:ascii="Times New Roman" w:eastAsia="Times New Roman" w:hAnsi="Times New Roman" w:cs="Times New Roman"/>
+          <w:sz w:val="24"/>
+          <w:szCs w:val="24"/>
+          <w:lang w:eastAsia="en-IN"/>
+        </w:rPr>
+        <w:t xml:space="preserve"> Replace digit if:</w:t>
+      </w:r>
+    </w:p>
+    <w:p>
+      <w:pPr>
+        <w:tabs>
+          <w:tab w:val="left" w:pos="916"/>
+          <w:tab w:val="left" w:pos="1832"/>
+          <w:tab w:val="left" w:pos="2748"/>
+          <w:tab w:val="left" w:pos="3664"/>
+          <w:tab w:val="left" w:pos="4580"/>
+          <w:tab w:val="left" w:pos="5496"/>
+          <w:tab w:val="left" w:pos="6412"/>
+          <w:tab w:val="left" w:pos="7328"/>
+          <w:tab w:val="left" w:pos="8244"/>
+          <w:tab w:val="left" w:pos="9160"/>
+          <w:tab w:val="left" w:pos="10076"/>
+          <w:tab w:val="left" w:pos="10992"/>
+          <w:tab w:val="left" w:pos="11908"/>
+          <w:tab w:val="left" w:pos="12824"/>
+          <w:tab w:val="left" w:pos="13740"/>
+          <w:tab w:val="left" w:pos="14656"/>
+        </w:tabs>
+        <w:spacing w:after="0" w:line="240" w:lineRule="auto"/>
+        <w:rPr>
+          <w:rFonts w:ascii="Courier New" w:eastAsia="Times New Roman" w:hAnsi="Courier New" w:cs="Courier New"/>
+          <w:sz w:val="20"/>
+          <w:lang w:eastAsia="en-IN"/>
+        </w:rPr>
+      </w:pPr>
+      <w:r>
+        <w:rPr>
+          <w:rFonts w:ascii="Courier New" w:eastAsia="Times New Roman" w:hAnsi="Courier New" w:cs="Courier New"/>
+          <w:sz w:val="20"/>
+          <w:lang w:eastAsia="en-IN"/>
+        </w:rPr>
+        <w:t>digit &gt; running average</w:t>
+      </w:r>
+    </w:p>
+    <w:p>
+      <w:pPr>
+        <w:spacing w:before="100" w:beforeAutospacing="1" w:after="100" w:afterAutospacing="1" w:line="240" w:lineRule="auto"/>
+        <w:rPr>
+          <w:rFonts w:ascii="Times New Roman" w:eastAsia="Times New Roman" w:hAnsi="Times New Roman" w:cs="Times New Roman"/>
+          <w:sz w:val="24"/>
+          <w:szCs w:val="24"/>
+          <w:lang w:eastAsia="en-IN"/>
+        </w:rPr>
+      </w:pPr>
+      <w:r>
+        <w:rPr>
+          <w:rFonts w:ascii="Times New Roman" w:eastAsia="Times New Roman" w:hAnsi="Times New Roman" w:cs="Times New Roman"/>
+          <w:sz w:val="24"/>
+          <w:szCs w:val="24"/>
+          <w:lang w:eastAsia="en-IN"/>
+        </w:rPr>
+        <w:t>Else if:</w:t>
+      </w:r>
+    </w:p>
+    <w:p>
+      <w:pPr>
+        <w:tabs>
+          <w:tab w:val="left" w:pos="916"/>
+          <w:tab w:val="left" w:pos="1832"/>
+          <w:tab w:val="left" w:pos="2748"/>
+          <w:tab w:val="left" w:pos="3664"/>
+          <w:tab w:val="left" w:pos="4580"/>
+          <w:tab w:val="left" w:pos="5496"/>
+          <w:tab w:val="left" w:pos="6412"/>
+          <w:tab w:val="left" w:pos="7328"/>
+          <w:tab w:val="left" w:pos="8244"/>
+          <w:tab w:val="left" w:pos="9160"/>
+          <w:tab w:val="left" w:pos="10076"/>
+          <w:tab w:val="left" w:pos="10992"/>
+          <w:tab w:val="left" w:pos="11908"/>
+          <w:tab w:val="left" w:pos="12824"/>
+          <w:tab w:val="left" w:pos="13740"/>
+          <w:tab w:val="left" w:pos="14656"/>
+        </w:tabs>
+        <w:spacing w:after="0" w:line="240" w:lineRule="auto"/>
+        <w:rPr>
+          <w:rFonts w:ascii="Courier New" w:eastAsia="Times New Roman" w:hAnsi="Courier New" w:cs="Courier New"/>
+          <w:sz w:val="20"/>
+          <w:lang w:eastAsia="en-IN"/>
+        </w:rPr>
+      </w:pPr>
+      <w:r>
+        <w:rPr>
+          <w:rFonts w:ascii="Courier New" w:eastAsia="Times New Roman" w:hAnsi="Courier New" w:cs="Courier New"/>
+          <w:sz w:val="20"/>
+          <w:lang w:eastAsia="en-IN"/>
+        </w:rPr>
+        <w:t>digit &lt; running average → replace with 0</w:t>
+      </w:r>
+    </w:p>
+    <w:p>
+      <w:pPr>
+        <w:spacing w:after="0" w:line="240" w:lineRule="auto"/>
+        <w:rPr>
+          <w:rFonts w:ascii="Times New Roman" w:eastAsia="Times New Roman" w:hAnsi="Times New Roman" w:cs="Times New Roman"/>
+          <w:sz w:val="24"/>
+          <w:szCs w:val="24"/>
+          <w:lang w:eastAsia="en-IN"/>
+        </w:rPr>
+      </w:pPr>
+      <w:r>
+        <w:rPr>
+          <w:rFonts w:ascii="Times New Roman" w:eastAsia="Times New Roman" w:hAnsi="Times New Roman" w:cs="Times New Roman"/>
+          <w:sz w:val="24"/>
+          <w:szCs w:val="24"/>
+          <w:lang w:eastAsia="en-IN"/>
+        </w:rPr>
+        <w:pict w14:anchorId="52273FA5">
+          <v:rect id="_x0000_i1044" style="width:0;height:1.5pt" o:hralign="center" o:hrstd="t" o:hr="t" fillcolor="#a0a0a0" stroked="f"/>
+        </w:pict>
+      </w:r>
+    </w:p>
+    <w:p>
+      <w:pPr>
+        <w:spacing w:before="100" w:beforeAutospacing="1" w:after="100" w:afterAutospacing="1" w:line="240" w:lineRule="auto"/>
+        <w:outlineLvl w:val="1"/>
+        <w:rPr>
+          <w:rFonts w:ascii="Times New Roman" w:eastAsia="Times New Roman" w:hAnsi="Times New Roman" w:cs="Times New Roman"/>
+          <w:b/>
+          <w:bCs/>
+          <w:sz w:val="36"/>
+          <w:szCs w:val="36"/>
+          <w:lang w:eastAsia="en-IN"/>
+        </w:rPr>
+      </w:pPr>
+      <w:r>
+        <w:rPr>
+          <w:rFonts w:ascii="Segoe UI Emoji" w:eastAsia="Times New Roman" w:hAnsi="Segoe UI Emoji" w:cs="Segoe UI Emoji"/>
+          <w:b/>
+          <w:bCs/>
+          <w:sz w:val="36"/>
+          <w:szCs w:val="36"/>
+          <w:lang w:eastAsia="en-IN"/>
+        </w:rPr>
+        <w:t>🧠</w:t>
+      </w:r>
+      <w:r>
+        <w:rPr>
+          <w:rFonts w:ascii="Times New Roman" w:eastAsia="Times New Roman" w:hAnsi="Times New Roman" w:cs="Times New Roman"/>
+          <w:b/>
+          <w:bCs/>
+          <w:sz w:val="36"/>
+          <w:szCs w:val="36"/>
+          <w:lang w:eastAsia="en-IN"/>
+        </w:rPr>
+        <w:t xml:space="preserve"> 6. (Triple Condition Monster)</w:t>
+      </w:r>
+    </w:p>
+    <w:p>
+      <w:pPr>
+        <w:spacing w:before="100" w:beforeAutospacing="1" w:after="100" w:afterAutospacing="1" w:line="240" w:lineRule="auto"/>
+        <w:rPr>
+          <w:rFonts w:ascii="Times New Roman" w:eastAsia="Times New Roman" w:hAnsi="Times New Roman" w:cs="Times New Roman"/>
+          <w:sz w:val="24"/>
+          <w:szCs w:val="24"/>
+          <w:lang w:eastAsia="en-IN"/>
+        </w:rPr>
+      </w:pPr>
+      <w:r>
+        <w:rPr>
+          <w:rFonts w:ascii="Segoe UI Emoji" w:eastAsia="Times New Roman" w:hAnsi="Segoe UI Emoji" w:cs="Segoe UI Emoji"/>
+          <w:sz w:val="24"/>
+          <w:szCs w:val="24"/>
+          <w:lang w:eastAsia="en-IN"/>
+        </w:rPr>
+        <w:t>👉</w:t>
+      </w:r>
+      <w:r>
+        <w:rPr>
+          <w:rFonts w:ascii="Times New Roman" w:eastAsia="Times New Roman" w:hAnsi="Times New Roman" w:cs="Times New Roman"/>
+          <w:sz w:val="24"/>
+          <w:szCs w:val="24"/>
+          <w:lang w:eastAsia="en-IN"/>
+        </w:rPr>
+        <w:t xml:space="preserve"> Replace digit if ALL true:</w:t>
+      </w:r>
+    </w:p>
+    <w:p>
+      <w:pPr>
+        <w:tabs>
+          <w:tab w:val="left" w:pos="916"/>
+          <w:tab w:val="left" w:pos="1832"/>
+          <w:tab w:val="left" w:pos="2748"/>
+          <w:tab w:val="left" w:pos="3664"/>
+          <w:tab w:val="left" w:pos="4580"/>
+          <w:tab w:val="left" w:pos="5496"/>
+          <w:tab w:val="left" w:pos="6412"/>
+          <w:tab w:val="left" w:pos="7328"/>
+          <w:tab w:val="left" w:pos="8244"/>
+          <w:tab w:val="left" w:pos="9160"/>
+          <w:tab w:val="left" w:pos="10076"/>
+          <w:tab w:val="left" w:pos="10992"/>
+          <w:tab w:val="left" w:pos="11908"/>
+          <w:tab w:val="left" w:pos="12824"/>
+          <w:tab w:val="left" w:pos="13740"/>
+          <w:tab w:val="left" w:pos="14656"/>
+        </w:tabs>
+        <w:spacing w:after="0" w:line="240" w:lineRule="auto"/>
+        <w:rPr>
+          <w:rFonts w:ascii="Courier New" w:eastAsia="Times New Roman" w:hAnsi="Courier New" w:cs="Courier New"/>
+          <w:sz w:val="20"/>
+          <w:lang w:eastAsia="en-IN"/>
+        </w:rPr>
+      </w:pPr>
+      <w:r>
+        <w:rPr>
+          <w:rFonts w:ascii="Courier New" w:eastAsia="Times New Roman" w:hAnsi="Courier New" w:cs="Courier New"/>
+          <w:sz w:val="20"/>
+          <w:lang w:eastAsia="en-IN"/>
+        </w:rPr>
+        <w:t xml:space="preserve">digit is prime  </w:t>
+      </w:r>
+      <w:r>
+        <w:rPr>
+          <w:rFonts w:ascii="Courier New" w:eastAsia="Times New Roman" w:hAnsi="Courier New" w:cs="Courier New"/>
+          <w:sz w:val="20"/>
+          <w:lang w:eastAsia="en-IN"/>
+        </w:rPr>
+        <w:br/>
+        <w:t xml:space="preserve">position is even  </w:t>
+      </w:r>
+      <w:r>
+        <w:rPr>
+          <w:rFonts w:ascii="Courier New" w:eastAsia="Times New Roman" w:hAnsi="Courier New" w:cs="Courier New"/>
+          <w:sz w:val="20"/>
+          <w:lang w:eastAsia="en-IN"/>
+        </w:rPr>
+        <w:br/>
+        <w:t>running sum is odd</w:t>
+      </w:r>
+    </w:p>
+    <w:p>
+      <w:pPr>
+        <w:spacing w:after="0" w:line="240" w:lineRule="auto"/>
+        <w:rPr>
+          <w:rFonts w:ascii="Times New Roman" w:eastAsia="Times New Roman" w:hAnsi="Times New Roman" w:cs="Times New Roman"/>
+          <w:sz w:val="24"/>
+          <w:szCs w:val="24"/>
+          <w:lang w:eastAsia="en-IN"/>
+        </w:rPr>
+      </w:pPr>
+      <w:r>
+        <w:rPr>
+          <w:rFonts w:ascii="Times New Roman" w:eastAsia="Times New Roman" w:hAnsi="Times New Roman" w:cs="Times New Roman"/>
+          <w:sz w:val="24"/>
+          <w:szCs w:val="24"/>
+          <w:lang w:eastAsia="en-IN"/>
+        </w:rPr>
+        <w:pict w14:anchorId="46C18CA9">
+          <v:rect id="_x0000_i1045" style="width:0;height:1.5pt" o:hralign="center" o:hrstd="t" o:hr="t" fillcolor="#a0a0a0" stroked="f"/>
+        </w:pict>
+      </w:r>
+    </w:p>
+    <w:p>
+      <w:pPr>
+        <w:spacing w:before="100" w:beforeAutospacing="1" w:after="100" w:afterAutospacing="1" w:line="240" w:lineRule="auto"/>
+        <w:outlineLvl w:val="1"/>
+        <w:rPr>
+          <w:rFonts w:ascii="Times New Roman" w:eastAsia="Times New Roman" w:hAnsi="Times New Roman" w:cs="Times New Roman"/>
+          <w:b/>
+          <w:bCs/>
+          <w:sz w:val="36"/>
+          <w:szCs w:val="36"/>
+          <w:lang w:eastAsia="en-IN"/>
+        </w:rPr>
+      </w:pPr>
+      <w:r>
+        <w:rPr>
+          <w:rFonts w:ascii="Segoe UI Emoji" w:eastAsia="Times New Roman" w:hAnsi="Segoe UI Emoji" w:cs="Segoe UI Emoji"/>
+          <w:b/>
+          <w:bCs/>
+          <w:sz w:val="36"/>
+          <w:szCs w:val="36"/>
+          <w:lang w:eastAsia="en-IN"/>
+        </w:rPr>
+        <w:t>🧠</w:t>
+      </w:r>
+      <w:r>
+        <w:rPr>
+          <w:rFonts w:ascii="Times New Roman" w:eastAsia="Times New Roman" w:hAnsi="Times New Roman" w:cs="Times New Roman"/>
+          <w:b/>
+          <w:bCs/>
+          <w:sz w:val="36"/>
+          <w:szCs w:val="36"/>
+          <w:lang w:eastAsia="en-IN"/>
+        </w:rPr>
+        <w:t xml:space="preserve"> 7. (Frequency Ranking)</w:t>
+      </w:r>
+    </w:p>
+    <w:p>
+      <w:pPr>
+        <w:spacing w:before="100" w:beforeAutospacing="1" w:after="100" w:afterAutospacing="1" w:line="240" w:lineRule="auto"/>
+        <w:rPr>
+          <w:rFonts w:ascii="Times New Roman" w:eastAsia="Times New Roman" w:hAnsi="Times New Roman" w:cs="Times New Roman"/>
+          <w:sz w:val="24"/>
+          <w:szCs w:val="24"/>
+          <w:lang w:eastAsia="en-IN"/>
+        </w:rPr>
+      </w:pPr>
+      <w:r>
+        <w:rPr>
+          <w:rFonts w:ascii="Segoe UI Emoji" w:eastAsia="Times New Roman" w:hAnsi="Segoe UI Emoji" w:cs="Segoe UI Emoji"/>
+          <w:sz w:val="24"/>
+          <w:szCs w:val="24"/>
+          <w:lang w:eastAsia="en-IN"/>
+        </w:rPr>
+        <w:t>👉</w:t>
+      </w:r>
+      <w:r>
+        <w:rPr>
+          <w:rFonts w:ascii="Times New Roman" w:eastAsia="Times New Roman" w:hAnsi="Times New Roman" w:cs="Times New Roman"/>
+          <w:sz w:val="24"/>
+          <w:szCs w:val="24"/>
+          <w:lang w:eastAsia="en-IN"/>
+        </w:rPr>
+        <w:t xml:space="preserve"> Replace:</w:t>
+      </w:r>
+    </w:p>
+    <w:p>
+      <w:pPr>
+        <w:numPr>
+          <w:ilvl w:val="0"/>
+          <w:numId w:val="7"/>
+        </w:numPr>
+        <w:spacing w:before="100" w:beforeAutospacing="1" w:after="100" w:afterAutospacing="1" w:line="240" w:lineRule="auto"/>
+        <w:rPr>
+          <w:rFonts w:ascii="Times New Roman" w:eastAsia="Times New Roman" w:hAnsi="Times New Roman" w:cs="Times New Roman"/>
+          <w:sz w:val="24"/>
+          <w:szCs w:val="24"/>
+          <w:lang w:eastAsia="en-IN"/>
+        </w:rPr>
+      </w:pPr>
+      <w:r>
+        <w:rPr>
+          <w:rFonts w:ascii="Times New Roman" w:eastAsia="Times New Roman" w:hAnsi="Times New Roman" w:cs="Times New Roman"/>
+          <w:sz w:val="24"/>
+          <w:szCs w:val="24"/>
+          <w:lang w:eastAsia="en-IN"/>
+        </w:rPr>
+        <w:t xml:space="preserve">most frequent digit → 9 </w:t>
+      </w:r>
+    </w:p>
+    <w:p>
+      <w:pPr>
+        <w:numPr>
+          <w:ilvl w:val="0"/>
+          <w:numId w:val="7"/>
+        </w:numPr>
+        <w:spacing w:before="100" w:beforeAutospacing="1" w:after="100" w:afterAutospacing="1" w:line="240" w:lineRule="auto"/>
+        <w:rPr>
+          <w:rFonts w:ascii="Times New Roman" w:eastAsia="Times New Roman" w:hAnsi="Times New Roman" w:cs="Times New Roman"/>
+          <w:sz w:val="24"/>
+          <w:szCs w:val="24"/>
+          <w:lang w:eastAsia="en-IN"/>
+        </w:rPr>
+      </w:pPr>
+      <w:r>
+        <w:rPr>
+          <w:rFonts w:ascii="Times New Roman" w:eastAsia="Times New Roman" w:hAnsi="Times New Roman" w:cs="Times New Roman"/>
+          <w:sz w:val="24"/>
+          <w:szCs w:val="24"/>
+          <w:lang w:eastAsia="en-IN"/>
+        </w:rPr>
+        <w:t xml:space="preserve">least frequent digit → 1 </w:t>
+      </w:r>
+    </w:p>
+    <w:p>
+      <w:pPr>
+        <w:numPr>
+          <w:ilvl w:val="0"/>
+          <w:numId w:val="7"/>
+        </w:numPr>
+        <w:spacing w:before="100" w:beforeAutospacing="1" w:after="100" w:afterAutospacing="1" w:line="240" w:lineRule="auto"/>
+        <w:rPr>
+          <w:rFonts w:ascii="Times New Roman" w:eastAsia="Times New Roman" w:hAnsi="Times New Roman" w:cs="Times New Roman"/>
+          <w:sz w:val="24"/>
+          <w:szCs w:val="24"/>
+          <w:lang w:eastAsia="en-IN"/>
+        </w:rPr>
+      </w:pPr>
+      <w:r>
+        <w:rPr>
+          <w:rFonts w:ascii="Times New Roman" w:eastAsia="Times New Roman" w:hAnsi="Times New Roman" w:cs="Times New Roman"/>
+          <w:sz w:val="24"/>
+          <w:szCs w:val="24"/>
+          <w:lang w:eastAsia="en-IN"/>
+        </w:rPr>
+        <w:t xml:space="preserve">others → unchanged </w:t>
+      </w:r>
+    </w:p>
+    <w:p>
+      <w:pPr>
+        <w:spacing w:before="100" w:beforeAutospacing="1" w:after="100" w:afterAutospacing="1" w:line="240" w:lineRule="auto"/>
+        <w:rPr>
+          <w:rFonts w:ascii="Times New Roman" w:eastAsia="Times New Roman" w:hAnsi="Times New Roman" w:cs="Times New Roman"/>
+          <w:sz w:val="24"/>
+          <w:szCs w:val="24"/>
+          <w:lang w:eastAsia="en-IN"/>
+        </w:rPr>
+      </w:pPr>
+      <w:r>
+        <w:rPr>
+          <w:rFonts w:ascii="Segoe UI Emoji" w:eastAsia="Times New Roman" w:hAnsi="Segoe UI Emoji" w:cs="Segoe UI Emoji"/>
+          <w:sz w:val="24"/>
+          <w:szCs w:val="24"/>
+          <w:lang w:eastAsia="en-IN"/>
+        </w:rPr>
+        <w:t>⚠️</w:t>
+      </w:r>
+      <w:r>
+        <w:rPr>
+          <w:rFonts w:ascii="Times New Roman" w:eastAsia="Times New Roman" w:hAnsi="Times New Roman" w:cs="Times New Roman"/>
+          <w:sz w:val="24"/>
+          <w:szCs w:val="24"/>
+          <w:lang w:eastAsia="en-IN"/>
+        </w:rPr>
+        <w:t xml:space="preserve"> Handle ties carefully</w:t>
+      </w:r>
+    </w:p>
+    <w:p>
+      <w:pPr>
+        <w:spacing w:after="0" w:line="240" w:lineRule="auto"/>
+        <w:rPr>
+          <w:rFonts w:ascii="Times New Roman" w:eastAsia="Times New Roman" w:hAnsi="Times New Roman" w:cs="Times New Roman"/>
+          <w:sz w:val="24"/>
+          <w:szCs w:val="24"/>
+          <w:lang w:eastAsia="en-IN"/>
+        </w:rPr>
+      </w:pPr>
+      <w:r>
+        <w:rPr>
+          <w:rFonts w:ascii="Times New Roman" w:eastAsia="Times New Roman" w:hAnsi="Times New Roman" w:cs="Times New Roman"/>
+          <w:sz w:val="24"/>
+          <w:szCs w:val="24"/>
+          <w:lang w:eastAsia="en-IN"/>
+        </w:rPr>
+        <w:pict w14:anchorId="0A3E0292">
+          <v:rect id="_x0000_i1046" style="width:0;height:1.5pt" o:hralign="center" o:hrstd="t" o:hr="t" fillcolor="#a0a0a0" stroked="f"/>
+        </w:pict>
+      </w:r>
+    </w:p>
+    <w:p>
+      <w:pPr>
+        <w:spacing w:before="100" w:beforeAutospacing="1" w:after="100" w:afterAutospacing="1" w:line="240" w:lineRule="auto"/>
+        <w:outlineLvl w:val="1"/>
+        <w:rPr>
+          <w:rFonts w:ascii="Times New Roman" w:eastAsia="Times New Roman" w:hAnsi="Times New Roman" w:cs="Times New Roman"/>
+          <w:b/>
+          <w:bCs/>
+          <w:sz w:val="36"/>
+          <w:szCs w:val="36"/>
+          <w:lang w:eastAsia="en-IN"/>
+        </w:rPr>
+      </w:pPr>
+      <w:r>
+        <w:rPr>
+          <w:rFonts w:ascii="Segoe UI Emoji" w:eastAsia="Times New Roman" w:hAnsi="Segoe UI Emoji" w:cs="Segoe UI Emoji"/>
+          <w:b/>
+          <w:bCs/>
+          <w:sz w:val="36"/>
+          <w:szCs w:val="36"/>
+          <w:lang w:eastAsia="en-IN"/>
+        </w:rPr>
+        <w:t>🧠</w:t>
+      </w:r>
+      <w:r>
+        <w:rPr>
+          <w:rFonts w:ascii="Times New Roman" w:eastAsia="Times New Roman" w:hAnsi="Times New Roman" w:cs="Times New Roman"/>
+          <w:b/>
+          <w:bCs/>
+          <w:sz w:val="36"/>
+          <w:szCs w:val="36"/>
+          <w:lang w:eastAsia="en-IN"/>
+        </w:rPr>
+        <w:t xml:space="preserve"> 8. (Dynamic Position Shift)</w:t>
+      </w:r>
+    </w:p>
+    <w:p>
+      <w:pPr>
+        <w:spacing w:before="100" w:beforeAutospacing="1" w:after="100" w:afterAutospacing="1" w:line="240" w:lineRule="auto"/>
+        <w:rPr>
+          <w:rFonts w:ascii="Times New Roman" w:eastAsia="Times New Roman" w:hAnsi="Times New Roman" w:cs="Times New Roman"/>
+          <w:sz w:val="24"/>
+          <w:szCs w:val="24"/>
+          <w:lang w:eastAsia="en-IN"/>
+        </w:rPr>
+      </w:pPr>
+      <w:r>
+        <w:rPr>
+          <w:rFonts w:ascii="Segoe UI Emoji" w:eastAsia="Times New Roman" w:hAnsi="Segoe UI Emoji" w:cs="Segoe UI Emoji"/>
+          <w:sz w:val="24"/>
+          <w:szCs w:val="24"/>
+          <w:lang w:eastAsia="en-IN"/>
+        </w:rPr>
+        <w:t>👉</w:t>
+      </w:r>
+      <w:r>
+        <w:rPr>
+          <w:rFonts w:ascii="Times New Roman" w:eastAsia="Times New Roman" w:hAnsi="Times New Roman" w:cs="Times New Roman"/>
+          <w:sz w:val="24"/>
+          <w:szCs w:val="24"/>
+          <w:lang w:eastAsia="en-IN"/>
+        </w:rPr>
+        <w:t xml:space="preserve"> Replace digit if:</w:t>
+      </w:r>
+    </w:p>
+    <w:p>
+      <w:pPr>
+        <w:tabs>
+          <w:tab w:val="left" w:pos="916"/>
+          <w:tab w:val="left" w:pos="1832"/>
+          <w:tab w:val="left" w:pos="2748"/>
+          <w:tab w:val="left" w:pos="3664"/>
+          <w:tab w:val="left" w:pos="4580"/>
+          <w:tab w:val="left" w:pos="5496"/>
+          <w:tab w:val="left" w:pos="6412"/>
+          <w:tab w:val="left" w:pos="7328"/>
+          <w:tab w:val="left" w:pos="8244"/>
+          <w:tab w:val="left" w:pos="9160"/>
+          <w:tab w:val="left" w:pos="10076"/>
+          <w:tab w:val="left" w:pos="10992"/>
+          <w:tab w:val="left" w:pos="11908"/>
+          <w:tab w:val="left" w:pos="12824"/>
+          <w:tab w:val="left" w:pos="13740"/>
+          <w:tab w:val="left" w:pos="14656"/>
+        </w:tabs>
+        <w:spacing w:after="0" w:line="240" w:lineRule="auto"/>
+        <w:rPr>
+          <w:rFonts w:ascii="Courier New" w:eastAsia="Times New Roman" w:hAnsi="Courier New" w:cs="Courier New"/>
+          <w:sz w:val="20"/>
+          <w:lang w:eastAsia="en-IN"/>
+        </w:rPr>
+      </w:pPr>
+      <w:r>
+        <w:rPr>
+          <w:rFonts w:ascii="Courier New" w:eastAsia="Times New Roman" w:hAnsi="Courier New" w:cs="Courier New"/>
+          <w:sz w:val="20"/>
+          <w:lang w:eastAsia="en-IN"/>
+        </w:rPr>
+        <w:t>digit == number of digits to its right</w:t>
+      </w:r>
+    </w:p>
+    <w:p>
+      <w:pPr>
+        <w:spacing w:after="0" w:line="240" w:lineRule="auto"/>
+        <w:rPr>
+          <w:rFonts w:ascii="Times New Roman" w:eastAsia="Times New Roman" w:hAnsi="Times New Roman" w:cs="Times New Roman"/>
+          <w:sz w:val="24"/>
+          <w:szCs w:val="24"/>
+          <w:lang w:eastAsia="en-IN"/>
+        </w:rPr>
+      </w:pPr>
+      <w:r>
+        <w:rPr>
+          <w:rFonts w:ascii="Times New Roman" w:eastAsia="Times New Roman" w:hAnsi="Times New Roman" w:cs="Times New Roman"/>
+          <w:sz w:val="24"/>
+          <w:szCs w:val="24"/>
+          <w:lang w:eastAsia="en-IN"/>
+        </w:rPr>
+        <w:pict w14:anchorId="07F53FFC">
+          <v:rect id="_x0000_i1047" style="width:0;height:1.5pt" o:hralign="center" o:hrstd="t" o:hr="t" fillcolor="#a0a0a0" stroked="f"/>
+        </w:pict>
+      </w:r>
+    </w:p>
+    <w:p>
+      <w:pPr>
+        <w:spacing w:before="100" w:beforeAutospacing="1" w:after="100" w:afterAutospacing="1" w:line="240" w:lineRule="auto"/>
+        <w:outlineLvl w:val="1"/>
+        <w:rPr>
+          <w:rFonts w:ascii="Times New Roman" w:eastAsia="Times New Roman" w:hAnsi="Times New Roman" w:cs="Times New Roman"/>
+          <w:b/>
+          <w:bCs/>
+          <w:sz w:val="36"/>
+          <w:szCs w:val="36"/>
+          <w:lang w:eastAsia="en-IN"/>
+        </w:rPr>
+      </w:pPr>
+      <w:r>
+        <w:rPr>
+          <w:rFonts w:ascii="Segoe UI Emoji" w:eastAsia="Times New Roman" w:hAnsi="Segoe UI Emoji" w:cs="Segoe UI Emoji"/>
+          <w:b/>
+          <w:bCs/>
+          <w:sz w:val="36"/>
+          <w:szCs w:val="36"/>
+          <w:lang w:eastAsia="en-IN"/>
+        </w:rPr>
+        <w:t>🧠</w:t>
+      </w:r>
+      <w:r>
+        <w:rPr>
+          <w:rFonts w:ascii="Times New Roman" w:eastAsia="Times New Roman" w:hAnsi="Times New Roman" w:cs="Times New Roman"/>
+          <w:b/>
+          <w:bCs/>
+          <w:sz w:val="36"/>
+          <w:szCs w:val="36"/>
+          <w:lang w:eastAsia="en-IN"/>
+        </w:rPr>
+        <w:t xml:space="preserve"> 9. (Nested Dependency)</w:t>
+      </w:r>
+    </w:p>
+    <w:p>
+      <w:pPr>
+        <w:spacing w:before="100" w:beforeAutospacing="1" w:after="100" w:afterAutospacing="1" w:line="240" w:lineRule="auto"/>
+        <w:rPr>
+          <w:rFonts w:ascii="Times New Roman" w:eastAsia="Times New Roman" w:hAnsi="Times New Roman" w:cs="Times New Roman"/>
+          <w:sz w:val="24"/>
+          <w:szCs w:val="24"/>
+          <w:lang w:eastAsia="en-IN"/>
+        </w:rPr>
+      </w:pPr>
+      <w:r>
+        <w:rPr>
+          <w:rFonts w:ascii="Segoe UI Emoji" w:eastAsia="Times New Roman" w:hAnsi="Segoe UI Emoji" w:cs="Segoe UI Emoji"/>
+          <w:sz w:val="24"/>
+          <w:szCs w:val="24"/>
+          <w:lang w:eastAsia="en-IN"/>
+        </w:rPr>
+        <w:lastRenderedPageBreak/>
+        <w:t>👉</w:t>
+      </w:r>
+      <w:r>
+        <w:rPr>
+          <w:rFonts w:ascii="Times New Roman" w:eastAsia="Times New Roman" w:hAnsi="Times New Roman" w:cs="Times New Roman"/>
+          <w:sz w:val="24"/>
+          <w:szCs w:val="24"/>
+          <w:lang w:eastAsia="en-IN"/>
+        </w:rPr>
+        <w:t xml:space="preserve"> Replace digit if:</w:t>
+      </w:r>
+    </w:p>
+    <w:p>
+      <w:pPr>
+        <w:tabs>
+          <w:tab w:val="left" w:pos="916"/>
+          <w:tab w:val="left" w:pos="1832"/>
+          <w:tab w:val="left" w:pos="2748"/>
+          <w:tab w:val="left" w:pos="3664"/>
+          <w:tab w:val="left" w:pos="4580"/>
+          <w:tab w:val="left" w:pos="5496"/>
+          <w:tab w:val="left" w:pos="6412"/>
+          <w:tab w:val="left" w:pos="7328"/>
+          <w:tab w:val="left" w:pos="8244"/>
+          <w:tab w:val="left" w:pos="9160"/>
+          <w:tab w:val="left" w:pos="10076"/>
+          <w:tab w:val="left" w:pos="10992"/>
+          <w:tab w:val="left" w:pos="11908"/>
+          <w:tab w:val="left" w:pos="12824"/>
+          <w:tab w:val="left" w:pos="13740"/>
+          <w:tab w:val="left" w:pos="14656"/>
+        </w:tabs>
+        <w:spacing w:after="0" w:line="240" w:lineRule="auto"/>
+        <w:rPr>
+          <w:rFonts w:ascii="Courier New" w:eastAsia="Times New Roman" w:hAnsi="Courier New" w:cs="Courier New"/>
+          <w:sz w:val="20"/>
+          <w:lang w:eastAsia="en-IN"/>
+        </w:rPr>
+      </w:pPr>
+      <w:r>
+        <w:rPr>
+          <w:rFonts w:ascii="Courier New" w:eastAsia="Times New Roman" w:hAnsi="Courier New" w:cs="Courier New"/>
+          <w:sz w:val="20"/>
+          <w:lang w:eastAsia="en-IN"/>
+        </w:rPr>
+        <w:t>sum of digits to left == sum of digits to right</w:t>
+      </w:r>
+    </w:p>
+    <w:p>
+      <w:pPr>
+        <w:spacing w:after="0" w:line="240" w:lineRule="auto"/>
+        <w:rPr>
+          <w:rFonts w:ascii="Times New Roman" w:eastAsia="Times New Roman" w:hAnsi="Times New Roman" w:cs="Times New Roman"/>
+          <w:sz w:val="24"/>
+          <w:szCs w:val="24"/>
+          <w:lang w:eastAsia="en-IN"/>
+        </w:rPr>
+      </w:pPr>
+      <w:r>
+        <w:rPr>
+          <w:rFonts w:ascii="Times New Roman" w:eastAsia="Times New Roman" w:hAnsi="Times New Roman" w:cs="Times New Roman"/>
+          <w:sz w:val="24"/>
+          <w:szCs w:val="24"/>
+          <w:lang w:eastAsia="en-IN"/>
+        </w:rPr>
+        <w:pict w14:anchorId="66A448B6">
+          <v:rect id="_x0000_i1048" style="width:0;height:1.5pt" o:hralign="center" o:hrstd="t" o:hr="t" fillcolor="#a0a0a0" stroked="f"/>
+        </w:pict>
+      </w:r>
+    </w:p>
+    <w:p>
+      <w:pPr>
+        <w:spacing w:before="100" w:beforeAutospacing="1" w:after="100" w:afterAutospacing="1" w:line="240" w:lineRule="auto"/>
+        <w:outlineLvl w:val="1"/>
+        <w:rPr>
+          <w:rFonts w:ascii="Times New Roman" w:eastAsia="Times New Roman" w:hAnsi="Times New Roman" w:cs="Times New Roman"/>
+          <w:b/>
+          <w:bCs/>
+          <w:sz w:val="36"/>
+          <w:szCs w:val="36"/>
+          <w:lang w:eastAsia="en-IN"/>
+        </w:rPr>
+      </w:pPr>
+      <w:r>
+        <w:rPr>
+          <w:rFonts w:ascii="Segoe UI Emoji" w:eastAsia="Times New Roman" w:hAnsi="Segoe UI Emoji" w:cs="Segoe UI Emoji"/>
+          <w:b/>
+          <w:bCs/>
+          <w:sz w:val="36"/>
+          <w:szCs w:val="36"/>
+          <w:lang w:eastAsia="en-IN"/>
+        </w:rPr>
+        <w:t>🧠</w:t>
+      </w:r>
+      <w:r>
+        <w:rPr>
+          <w:rFonts w:ascii="Times New Roman" w:eastAsia="Times New Roman" w:hAnsi="Times New Roman" w:cs="Times New Roman"/>
+          <w:b/>
+          <w:bCs/>
+          <w:sz w:val="36"/>
+          <w:szCs w:val="36"/>
+          <w:lang w:eastAsia="en-IN"/>
+        </w:rPr>
+        <w:t xml:space="preserve"> 10. (FINAL BOSS </w:t>
+      </w:r>
+      <w:r>
+        <w:rPr>
+          <w:rFonts w:ascii="Segoe UI Emoji" w:eastAsia="Times New Roman" w:hAnsi="Segoe UI Emoji" w:cs="Segoe UI Emoji"/>
+          <w:b/>
+          <w:bCs/>
+          <w:sz w:val="36"/>
+          <w:szCs w:val="36"/>
+          <w:lang w:eastAsia="en-IN"/>
+        </w:rPr>
+        <w:t>💀</w:t>
+      </w:r>
+      <w:r>
+        <w:rPr>
+          <w:rFonts w:ascii="Times New Roman" w:eastAsia="Times New Roman" w:hAnsi="Times New Roman" w:cs="Times New Roman"/>
+          <w:b/>
+          <w:bCs/>
+          <w:sz w:val="36"/>
+          <w:szCs w:val="36"/>
+          <w:lang w:eastAsia="en-IN"/>
+        </w:rPr>
+        <w:t>)</w:t>
+      </w:r>
+    </w:p>
+    <w:p>
+      <w:pPr>
+        <w:spacing w:before="100" w:beforeAutospacing="1" w:after="100" w:afterAutospacing="1" w:line="240" w:lineRule="auto"/>
+        <w:rPr>
+          <w:rFonts w:ascii="Times New Roman" w:eastAsia="Times New Roman" w:hAnsi="Times New Roman" w:cs="Times New Roman"/>
+          <w:sz w:val="24"/>
+          <w:szCs w:val="24"/>
+          <w:lang w:eastAsia="en-IN"/>
+        </w:rPr>
+      </w:pPr>
+      <w:r>
+        <w:rPr>
+          <w:rFonts w:ascii="Segoe UI Emoji" w:eastAsia="Times New Roman" w:hAnsi="Segoe UI Emoji" w:cs="Segoe UI Emoji"/>
+          <w:sz w:val="24"/>
+          <w:szCs w:val="24"/>
+          <w:lang w:eastAsia="en-IN"/>
+        </w:rPr>
+        <w:t>👉</w:t>
+      </w:r>
+      <w:r>
+        <w:rPr>
+          <w:rFonts w:ascii="Times New Roman" w:eastAsia="Times New Roman" w:hAnsi="Times New Roman" w:cs="Times New Roman"/>
+          <w:sz w:val="24"/>
+          <w:szCs w:val="24"/>
+          <w:lang w:eastAsia="en-IN"/>
+        </w:rPr>
+        <w:t xml:space="preserve"> Replace digit if:</w:t>
+      </w:r>
+    </w:p>
+    <w:p>
+      <w:pPr>
+        <w:tabs>
+          <w:tab w:val="left" w:pos="916"/>
+          <w:tab w:val="left" w:pos="1832"/>
+          <w:tab w:val="left" w:pos="2748"/>
+          <w:tab w:val="left" w:pos="3664"/>
+          <w:tab w:val="left" w:pos="4580"/>
+          <w:tab w:val="left" w:pos="5496"/>
+          <w:tab w:val="left" w:pos="6412"/>
+          <w:tab w:val="left" w:pos="7328"/>
+          <w:tab w:val="left" w:pos="8244"/>
+          <w:tab w:val="left" w:pos="9160"/>
+          <w:tab w:val="left" w:pos="10076"/>
+          <w:tab w:val="left" w:pos="10992"/>
+          <w:tab w:val="left" w:pos="11908"/>
+          <w:tab w:val="left" w:pos="12824"/>
+          <w:tab w:val="left" w:pos="13740"/>
+          <w:tab w:val="left" w:pos="14656"/>
+        </w:tabs>
+        <w:spacing w:after="0" w:line="240" w:lineRule="auto"/>
+        <w:rPr>
+          <w:rFonts w:ascii="Courier New" w:eastAsia="Times New Roman" w:hAnsi="Courier New" w:cs="Courier New"/>
+          <w:sz w:val="20"/>
+          <w:lang w:eastAsia="en-IN"/>
+        </w:rPr>
+      </w:pPr>
+      <w:r>
+        <w:rPr>
+          <w:rFonts w:ascii="Courier New" w:eastAsia="Times New Roman" w:hAnsi="Courier New" w:cs="Courier New"/>
+          <w:sz w:val="20"/>
+          <w:lang w:eastAsia="en-IN"/>
+        </w:rPr>
+        <w:t>(</w:t>
+      </w:r>
+      <w:proofErr w:type="gramStart"/>
+      <w:r>
+        <w:rPr>
+          <w:rFonts w:ascii="Courier New" w:eastAsia="Times New Roman" w:hAnsi="Courier New" w:cs="Courier New"/>
+          <w:sz w:val="20"/>
+          <w:lang w:eastAsia="en-IN"/>
+        </w:rPr>
+        <w:t>digit</w:t>
+      </w:r>
+      <w:proofErr w:type="gramEnd"/>
+      <w:r>
+        <w:rPr>
+          <w:rFonts w:ascii="Courier New" w:eastAsia="Times New Roman" w:hAnsi="Courier New" w:cs="Courier New"/>
+          <w:sz w:val="20"/>
+          <w:lang w:eastAsia="en-IN"/>
+        </w:rPr>
+        <w:t>² + position + frequency + running sum) is prime</w:t>
+      </w:r>
+    </w:p>
+    <w:p>
+      <w:pPr>
+        <w:spacing w:before="100" w:beforeAutospacing="1" w:after="100" w:afterAutospacing="1" w:line="240" w:lineRule="auto"/>
+        <w:rPr>
+          <w:rFonts w:ascii="Times New Roman" w:eastAsia="Times New Roman" w:hAnsi="Times New Roman" w:cs="Times New Roman"/>
+          <w:sz w:val="24"/>
+          <w:szCs w:val="24"/>
+          <w:lang w:eastAsia="en-IN"/>
+        </w:rPr>
+      </w:pPr>
+      <w:r>
+        <w:rPr>
+          <w:rFonts w:ascii="Times New Roman" w:eastAsia="Times New Roman" w:hAnsi="Times New Roman" w:cs="Times New Roman"/>
+          <w:sz w:val="24"/>
+          <w:szCs w:val="24"/>
+          <w:lang w:eastAsia="en-IN"/>
+        </w:rPr>
+        <w:t>Else if:</w:t>
+      </w:r>
+    </w:p>
+    <w:p>
+      <w:pPr>
+        <w:tabs>
+          <w:tab w:val="left" w:pos="916"/>
+          <w:tab w:val="left" w:pos="1832"/>
+          <w:tab w:val="left" w:pos="2748"/>
+          <w:tab w:val="left" w:pos="3664"/>
+          <w:tab w:val="left" w:pos="4580"/>
+          <w:tab w:val="left" w:pos="5496"/>
+          <w:tab w:val="left" w:pos="6412"/>
+          <w:tab w:val="left" w:pos="7328"/>
+          <w:tab w:val="left" w:pos="8244"/>
+          <w:tab w:val="left" w:pos="9160"/>
+          <w:tab w:val="left" w:pos="10076"/>
+          <w:tab w:val="left" w:pos="10992"/>
+          <w:tab w:val="left" w:pos="11908"/>
+          <w:tab w:val="left" w:pos="12824"/>
+          <w:tab w:val="left" w:pos="13740"/>
+          <w:tab w:val="left" w:pos="14656"/>
+        </w:tabs>
+        <w:spacing w:after="0" w:line="240" w:lineRule="auto"/>
+        <w:rPr>
+          <w:rFonts w:ascii="Courier New" w:eastAsia="Times New Roman" w:hAnsi="Courier New" w:cs="Courier New"/>
+          <w:sz w:val="20"/>
+          <w:lang w:eastAsia="en-IN"/>
+        </w:rPr>
+      </w:pPr>
+      <w:r>
+        <w:rPr>
+          <w:rFonts w:ascii="Courier New" w:eastAsia="Times New Roman" w:hAnsi="Courier New" w:cs="Courier New"/>
+          <w:sz w:val="20"/>
+          <w:lang w:eastAsia="en-IN"/>
+        </w:rPr>
+        <w:t>value is even → replace with 2</w:t>
+      </w:r>
+    </w:p>
+    <w:p>
+      <w:pPr>
+        <w:spacing w:before="100" w:beforeAutospacing="1" w:after="100" w:afterAutospacing="1" w:line="240" w:lineRule="auto"/>
+        <w:rPr>
+          <w:rFonts w:ascii="Times New Roman" w:eastAsia="Times New Roman" w:hAnsi="Times New Roman" w:cs="Times New Roman"/>
+          <w:sz w:val="24"/>
+          <w:szCs w:val="24"/>
+          <w:lang w:eastAsia="en-IN"/>
+        </w:rPr>
+      </w:pPr>
+      <w:r>
+        <w:rPr>
+          <w:rFonts w:ascii="Times New Roman" w:eastAsia="Times New Roman" w:hAnsi="Times New Roman" w:cs="Times New Roman"/>
+          <w:sz w:val="24"/>
+          <w:szCs w:val="24"/>
+          <w:lang w:eastAsia="en-IN"/>
+        </w:rPr>
+        <w:t>Else if:</w:t>
+      </w:r>
+    </w:p>
+    <w:p>
+      <w:pPr>
+        <w:tabs>
+          <w:tab w:val="left" w:pos="916"/>
+          <w:tab w:val="left" w:pos="1832"/>
+          <w:tab w:val="left" w:pos="2748"/>
+          <w:tab w:val="left" w:pos="3664"/>
+          <w:tab w:val="left" w:pos="4580"/>
+          <w:tab w:val="left" w:pos="5496"/>
+          <w:tab w:val="left" w:pos="6412"/>
+          <w:tab w:val="left" w:pos="7328"/>
+          <w:tab w:val="left" w:pos="8244"/>
+          <w:tab w:val="left" w:pos="9160"/>
+          <w:tab w:val="left" w:pos="10076"/>
+          <w:tab w:val="left" w:pos="10992"/>
+          <w:tab w:val="left" w:pos="11908"/>
+          <w:tab w:val="left" w:pos="12824"/>
+          <w:tab w:val="left" w:pos="13740"/>
+          <w:tab w:val="left" w:pos="14656"/>
+        </w:tabs>
+        <w:spacing w:after="0" w:line="240" w:lineRule="auto"/>
+        <w:rPr>
+          <w:rFonts w:ascii="Courier New" w:eastAsia="Times New Roman" w:hAnsi="Courier New" w:cs="Courier New"/>
+          <w:sz w:val="20"/>
+          <w:lang w:eastAsia="en-IN"/>
+        </w:rPr>
+      </w:pPr>
+      <w:r>
+        <w:rPr>
+          <w:rFonts w:ascii="Courier New" w:eastAsia="Times New Roman" w:hAnsi="Courier New" w:cs="Courier New"/>
+          <w:sz w:val="20"/>
+          <w:lang w:eastAsia="en-IN"/>
+        </w:rPr>
+        <w:t>value divisible by 5 → replace with 5</w:t>
+      </w:r>
+    </w:p>
+    <w:p>
+      <w:pPr>
+        <w:spacing w:before="100" w:beforeAutospacing="1" w:after="100" w:afterAutospacing="1" w:line="240" w:lineRule="auto"/>
+        <w:rPr>
+          <w:rFonts w:ascii="Times New Roman" w:eastAsia="Times New Roman" w:hAnsi="Times New Roman" w:cs="Times New Roman"/>
+          <w:sz w:val="24"/>
+          <w:szCs w:val="24"/>
+          <w:lang w:eastAsia="en-IN"/>
+        </w:rPr>
+      </w:pPr>
+      <w:r>
+        <w:rPr>
+          <w:rFonts w:ascii="Times New Roman" w:eastAsia="Times New Roman" w:hAnsi="Times New Roman" w:cs="Times New Roman"/>
+          <w:sz w:val="24"/>
+          <w:szCs w:val="24"/>
+          <w:lang w:eastAsia="en-IN"/>
+        </w:rPr>
+        <w:t>Else:</w:t>
+      </w:r>
+    </w:p>
+    <w:p>
+      <w:pPr>
+        <w:tabs>
+          <w:tab w:val="left" w:pos="916"/>
+          <w:tab w:val="left" w:pos="1832"/>
+          <w:tab w:val="left" w:pos="2748"/>
+          <w:tab w:val="left" w:pos="3664"/>
+          <w:tab w:val="left" w:pos="4580"/>
+          <w:tab w:val="left" w:pos="5496"/>
+          <w:tab w:val="left" w:pos="6412"/>
+          <w:tab w:val="left" w:pos="7328"/>
+          <w:tab w:val="left" w:pos="8244"/>
+          <w:tab w:val="left" w:pos="9160"/>
+          <w:tab w:val="left" w:pos="10076"/>
+          <w:tab w:val="left" w:pos="10992"/>
+          <w:tab w:val="left" w:pos="11908"/>
+          <w:tab w:val="left" w:pos="12824"/>
+          <w:tab w:val="left" w:pos="13740"/>
+          <w:tab w:val="left" w:pos="14656"/>
+        </w:tabs>
+        <w:spacing w:after="0" w:line="240" w:lineRule="auto"/>
+        <w:rPr>
+          <w:rFonts w:ascii="Courier New" w:eastAsia="Times New Roman" w:hAnsi="Courier New" w:cs="Courier New"/>
+          <w:sz w:val="20"/>
+          <w:lang w:eastAsia="en-IN"/>
+        </w:rPr>
+      </w:pPr>
+      <w:r>
+        <w:rPr>
+          <w:rFonts w:ascii="Courier New" w:eastAsia="Times New Roman" w:hAnsi="Courier New" w:cs="Courier New"/>
+          <w:sz w:val="20"/>
+          <w:lang w:eastAsia="en-IN"/>
+        </w:rPr>
+        <w:t>keep digit</w:t>
+      </w:r>
+    </w:p>
+    <w:p>
+      <w:pPr>
+        <w:spacing w:after="0" w:line="240" w:lineRule="auto"/>
+        <w:rPr>
+          <w:rFonts w:ascii="Times New Roman" w:eastAsia="Times New Roman" w:hAnsi="Times New Roman" w:cs="Times New Roman"/>
+          <w:sz w:val="24"/>
+          <w:szCs w:val="24"/>
+          <w:lang w:eastAsia="en-IN"/>
+        </w:rPr>
+      </w:pPr>
+      <w:r>
+        <w:rPr>
+          <w:rFonts w:ascii="Times New Roman" w:eastAsia="Times New Roman" w:hAnsi="Times New Roman" w:cs="Times New Roman"/>
+          <w:sz w:val="24"/>
+          <w:szCs w:val="24"/>
+          <w:lang w:eastAsia="en-IN"/>
+        </w:rPr>
+        <w:pict w14:anchorId="478667BA">
+          <v:rect id="_x0000_i1049" style="width:0;height:1.5pt" o:hralign="center" o:hrstd="t" o:hr="t" fillcolor="#a0a0a0" stroked="f"/>
+        </w:pict>
+      </w:r>
+    </w:p>
+    <w:p>
+      <w:pPr>
+        <w:spacing w:before="100" w:beforeAutospacing="1" w:after="100" w:afterAutospacing="1" w:line="240" w:lineRule="auto"/>
+        <w:outlineLvl w:val="0"/>
+        <w:rPr>
+          <w:rFonts w:ascii="Times New Roman" w:eastAsia="Times New Roman" w:hAnsi="Times New Roman" w:cs="Times New Roman"/>
+          <w:b/>
+          <w:bCs/>
+          <w:kern w:val="36"/>
+          <w:sz w:val="48"/>
+          <w:szCs w:val="48"/>
+          <w:lang w:eastAsia="en-IN"/>
+        </w:rPr>
+      </w:pPr>
+      <w:r>
+        <w:rPr>
+          <w:rFonts w:ascii="Segoe UI Emoji" w:eastAsia="Times New Roman" w:hAnsi="Segoe UI Emoji" w:cs="Segoe UI Emoji"/>
+          <w:b/>
+          <w:bCs/>
+          <w:kern w:val="36"/>
+          <w:sz w:val="48"/>
+          <w:szCs w:val="48"/>
+          <w:lang w:eastAsia="en-IN"/>
+        </w:rPr>
+        <w:t>⚠️</w:t>
+      </w:r>
+      <w:r>
+        <w:rPr>
+          <w:rFonts w:ascii="Times New Roman" w:eastAsia="Times New Roman" w:hAnsi="Times New Roman" w:cs="Times New Roman"/>
+          <w:b/>
+          <w:bCs/>
+          <w:kern w:val="36"/>
+          <w:sz w:val="48"/>
+          <w:szCs w:val="48"/>
+          <w:lang w:eastAsia="en-IN"/>
+        </w:rPr>
+        <w:t xml:space="preserve"> Rules (STRICT)</w:t>
+      </w:r>
+    </w:p>
+    <w:p>
+      <w:pPr>
+        <w:numPr>
+          <w:ilvl w:val="0"/>
+          <w:numId w:val="8"/>
+        </w:numPr>
+        <w:spacing w:before="100" w:beforeAutospacing="1" w:after="100" w:afterAutospacing="1" w:line="240" w:lineRule="auto"/>
+        <w:rPr>
+          <w:rFonts w:ascii="Times New Roman" w:eastAsia="Times New Roman" w:hAnsi="Times New Roman" w:cs="Times New Roman"/>
+          <w:sz w:val="24"/>
+          <w:szCs w:val="24"/>
+          <w:lang w:eastAsia="en-IN"/>
+        </w:rPr>
+      </w:pPr>
+      <w:r>
+        <w:rPr>
+          <w:rFonts w:ascii="Segoe UI Emoji" w:eastAsia="Times New Roman" w:hAnsi="Segoe UI Emoji" w:cs="Segoe UI Emoji"/>
+          <w:sz w:val="24"/>
+          <w:szCs w:val="24"/>
+          <w:lang w:eastAsia="en-IN"/>
+        </w:rPr>
+        <w:t>❌</w:t>
+      </w:r>
+      <w:r>
+        <w:rPr>
+          <w:rFonts w:ascii="Times New Roman" w:eastAsia="Times New Roman" w:hAnsi="Times New Roman" w:cs="Times New Roman"/>
+          <w:sz w:val="24"/>
+          <w:szCs w:val="24"/>
+          <w:lang w:eastAsia="en-IN"/>
+        </w:rPr>
+        <w:t xml:space="preserve"> Don’t rush </w:t>
+      </w:r>
+    </w:p>
+    <w:p>
+      <w:pPr>
+        <w:numPr>
+          <w:ilvl w:val="0"/>
+          <w:numId w:val="8"/>
+        </w:numPr>
+        <w:spacing w:before="100" w:beforeAutospacing="1" w:after="100" w:afterAutospacing="1" w:line="240" w:lineRule="auto"/>
+        <w:rPr>
+          <w:rFonts w:ascii="Times New Roman" w:eastAsia="Times New Roman" w:hAnsi="Times New Roman" w:cs="Times New Roman"/>
+          <w:sz w:val="24"/>
+          <w:szCs w:val="24"/>
+          <w:lang w:eastAsia="en-IN"/>
+        </w:rPr>
+      </w:pPr>
+      <w:r>
+        <w:rPr>
+          <w:rFonts w:ascii="Segoe UI Emoji" w:eastAsia="Times New Roman" w:hAnsi="Segoe UI Emoji" w:cs="Segoe UI Emoji"/>
+          <w:sz w:val="24"/>
+          <w:szCs w:val="24"/>
+          <w:lang w:eastAsia="en-IN"/>
+        </w:rPr>
+        <w:t>❌</w:t>
+      </w:r>
+      <w:r>
+        <w:rPr>
+          <w:rFonts w:ascii="Times New Roman" w:eastAsia="Times New Roman" w:hAnsi="Times New Roman" w:cs="Times New Roman"/>
+          <w:sz w:val="24"/>
+          <w:szCs w:val="24"/>
+          <w:lang w:eastAsia="en-IN"/>
+        </w:rPr>
+        <w:t xml:space="preserve"> Don’t mix variables </w:t>
+      </w:r>
+    </w:p>
+    <w:p>
+      <w:pPr>
+        <w:numPr>
+          <w:ilvl w:val="0"/>
+          <w:numId w:val="8"/>
+        </w:numPr>
+        <w:spacing w:before="100" w:beforeAutospacing="1" w:after="100" w:afterAutospacing="1" w:line="240" w:lineRule="auto"/>
+        <w:rPr>
+          <w:rFonts w:ascii="Times New Roman" w:eastAsia="Times New Roman" w:hAnsi="Times New Roman" w:cs="Times New Roman"/>
+          <w:sz w:val="24"/>
+          <w:szCs w:val="24"/>
+          <w:lang w:eastAsia="en-IN"/>
+        </w:rPr>
+      </w:pPr>
+      <w:r>
+        <w:rPr>
+          <w:rFonts w:ascii="Segoe UI Emoji" w:eastAsia="Times New Roman" w:hAnsi="Segoe UI Emoji" w:cs="Segoe UI Emoji"/>
+          <w:sz w:val="24"/>
+          <w:szCs w:val="24"/>
+          <w:lang w:eastAsia="en-IN"/>
+        </w:rPr>
+        <w:t>✅</w:t>
+      </w:r>
+      <w:r>
+        <w:rPr>
+          <w:rFonts w:ascii="Times New Roman" w:eastAsia="Times New Roman" w:hAnsi="Times New Roman" w:cs="Times New Roman"/>
+          <w:sz w:val="24"/>
+          <w:szCs w:val="24"/>
+          <w:lang w:eastAsia="en-IN"/>
+        </w:rPr>
+        <w:t xml:space="preserve"> Break into steps </w:t>
+      </w:r>
+    </w:p>
+    <w:p>
+      <w:pPr>
+        <w:numPr>
+          <w:ilvl w:val="0"/>
+          <w:numId w:val="8"/>
+        </w:numPr>
+        <w:spacing w:before="100" w:beforeAutospacing="1" w:after="100" w:afterAutospacing="1" w:line="240" w:lineRule="auto"/>
+        <w:rPr>
+          <w:rFonts w:ascii="Times New Roman" w:eastAsia="Times New Roman" w:hAnsi="Times New Roman" w:cs="Times New Roman"/>
+          <w:sz w:val="24"/>
+          <w:szCs w:val="24"/>
+          <w:lang w:eastAsia="en-IN"/>
+        </w:rPr>
+      </w:pPr>
+      <w:r>
+        <w:rPr>
+          <w:rFonts w:ascii="Segoe UI Emoji" w:eastAsia="Times New Roman" w:hAnsi="Segoe UI Emoji" w:cs="Segoe UI Emoji"/>
+          <w:sz w:val="24"/>
+          <w:szCs w:val="24"/>
+          <w:lang w:eastAsia="en-IN"/>
+        </w:rPr>
+        <w:t>✅</w:t>
+      </w:r>
+      <w:r>
+        <w:rPr>
+          <w:rFonts w:ascii="Times New Roman" w:eastAsia="Times New Roman" w:hAnsi="Times New Roman" w:cs="Times New Roman"/>
+          <w:sz w:val="24"/>
+          <w:szCs w:val="24"/>
+          <w:lang w:eastAsia="en-IN"/>
+        </w:rPr>
+        <w:t xml:space="preserve"> Use clear variable names </w:t>
+      </w:r>
+    </w:p>
+    <w:p>
+      <w:pPr>
+        <w:spacing w:after="0" w:line="240" w:lineRule="auto"/>
+        <w:rPr>
+          <w:rFonts w:ascii="Times New Roman" w:eastAsia="Times New Roman" w:hAnsi="Times New Roman" w:cs="Times New Roman"/>
+          <w:sz w:val="24"/>
+          <w:szCs w:val="24"/>
+          <w:lang w:eastAsia="en-IN"/>
+        </w:rPr>
+      </w:pPr>
+      <w:r>
+        <w:rPr>
+          <w:rFonts w:ascii="Times New Roman" w:eastAsia="Times New Roman" w:hAnsi="Times New Roman" w:cs="Times New Roman"/>
+          <w:sz w:val="24"/>
+          <w:szCs w:val="24"/>
+          <w:lang w:eastAsia="en-IN"/>
+        </w:rPr>
+        <w:pict w14:anchorId="0A461CD8">
+          <v:rect id="_x0000_i1050" style="width:0;height:1.5pt" o:hralign="center" o:hrstd="t" o:hr="t" fillcolor="#a0a0a0" stroked="f"/>
+        </w:pict>
+      </w:r>
+    </w:p>
+    <w:p>
+      <w:pPr>
+        <w:spacing w:before="100" w:beforeAutospacing="1" w:after="100" w:afterAutospacing="1" w:line="240" w:lineRule="auto"/>
+        <w:outlineLvl w:val="0"/>
+        <w:rPr>
+          <w:rFonts w:ascii="Times New Roman" w:eastAsia="Times New Roman" w:hAnsi="Times New Roman" w:cs="Times New Roman"/>
+          <w:b/>
+          <w:bCs/>
+          <w:kern w:val="36"/>
+          <w:sz w:val="48"/>
+          <w:szCs w:val="48"/>
+          <w:lang w:eastAsia="en-IN"/>
+        </w:rPr>
+      </w:pPr>
+      <w:r>
+        <w:rPr>
+          <w:rFonts w:ascii="Segoe UI Emoji" w:eastAsia="Times New Roman" w:hAnsi="Segoe UI Emoji" w:cs="Segoe UI Emoji"/>
+          <w:b/>
+          <w:bCs/>
+          <w:kern w:val="36"/>
+          <w:sz w:val="48"/>
+          <w:szCs w:val="48"/>
+          <w:lang w:eastAsia="en-IN"/>
+        </w:rPr>
+        <w:t>🧠</w:t>
+      </w:r>
+      <w:r>
+        <w:rPr>
+          <w:rFonts w:ascii="Times New Roman" w:eastAsia="Times New Roman" w:hAnsi="Times New Roman" w:cs="Times New Roman"/>
+          <w:b/>
+          <w:bCs/>
+          <w:kern w:val="36"/>
+          <w:sz w:val="48"/>
+          <w:szCs w:val="48"/>
+          <w:lang w:eastAsia="en-IN"/>
+        </w:rPr>
+        <w:t xml:space="preserve"> Strategy (VERY IMPORTANT)</w:t>
+      </w:r>
+    </w:p>
+    <w:p>
+      <w:pPr>
+        <w:spacing w:before="100" w:beforeAutospacing="1" w:after="100" w:afterAutospacing="1" w:line="240" w:lineRule="auto"/>
+        <w:rPr>
+          <w:rFonts w:ascii="Times New Roman" w:eastAsia="Times New Roman" w:hAnsi="Times New Roman" w:cs="Times New Roman"/>
+          <w:sz w:val="24"/>
+          <w:szCs w:val="24"/>
+          <w:lang w:eastAsia="en-IN"/>
+        </w:rPr>
+      </w:pPr>
+      <w:r>
+        <w:rPr>
+          <w:rFonts w:ascii="Times New Roman" w:eastAsia="Times New Roman" w:hAnsi="Times New Roman" w:cs="Times New Roman"/>
+          <w:sz w:val="24"/>
+          <w:szCs w:val="24"/>
+          <w:lang w:eastAsia="en-IN"/>
+        </w:rPr>
+        <w:t>For each digit:</w:t>
+      </w:r>
+    </w:p>
+    <w:p>
+      <w:pPr>
+        <w:numPr>
+          <w:ilvl w:val="0"/>
+          <w:numId w:val="9"/>
+        </w:numPr>
+        <w:spacing w:before="100" w:beforeAutospacing="1" w:after="100" w:afterAutospacing="1" w:line="240" w:lineRule="auto"/>
+        <w:rPr>
+          <w:rFonts w:ascii="Times New Roman" w:eastAsia="Times New Roman" w:hAnsi="Times New Roman" w:cs="Times New Roman"/>
+          <w:sz w:val="24"/>
+          <w:szCs w:val="24"/>
+          <w:lang w:eastAsia="en-IN"/>
+        </w:rPr>
+      </w:pPr>
+      <w:r>
+        <w:rPr>
+          <w:rFonts w:ascii="Times New Roman" w:eastAsia="Times New Roman" w:hAnsi="Times New Roman" w:cs="Times New Roman"/>
+          <w:sz w:val="24"/>
+          <w:szCs w:val="24"/>
+          <w:lang w:eastAsia="en-IN"/>
+        </w:rPr>
+        <w:t xml:space="preserve">Calculate frequency </w:t>
+      </w:r>
+    </w:p>
+    <w:p>
+      <w:pPr>
+        <w:numPr>
+          <w:ilvl w:val="0"/>
+          <w:numId w:val="9"/>
+        </w:numPr>
+        <w:spacing w:before="100" w:beforeAutospacing="1" w:after="100" w:afterAutospacing="1" w:line="240" w:lineRule="auto"/>
+        <w:rPr>
+          <w:rFonts w:ascii="Times New Roman" w:eastAsia="Times New Roman" w:hAnsi="Times New Roman" w:cs="Times New Roman"/>
+          <w:sz w:val="24"/>
+          <w:szCs w:val="24"/>
+          <w:lang w:eastAsia="en-IN"/>
+        </w:rPr>
+      </w:pPr>
+      <w:r>
+        <w:rPr>
+          <w:rFonts w:ascii="Times New Roman" w:eastAsia="Times New Roman" w:hAnsi="Times New Roman" w:cs="Times New Roman"/>
+          <w:sz w:val="24"/>
+          <w:szCs w:val="24"/>
+          <w:lang w:eastAsia="en-IN"/>
+        </w:rPr>
+        <w:t xml:space="preserve">Get position </w:t>
+      </w:r>
+    </w:p>
+    <w:p>
+      <w:pPr>
+        <w:numPr>
+          <w:ilvl w:val="0"/>
+          <w:numId w:val="9"/>
+        </w:numPr>
+        <w:spacing w:before="100" w:beforeAutospacing="1" w:after="100" w:afterAutospacing="1" w:line="240" w:lineRule="auto"/>
+        <w:rPr>
+          <w:rFonts w:ascii="Times New Roman" w:eastAsia="Times New Roman" w:hAnsi="Times New Roman" w:cs="Times New Roman"/>
+          <w:sz w:val="24"/>
+          <w:szCs w:val="24"/>
+          <w:lang w:eastAsia="en-IN"/>
+        </w:rPr>
+      </w:pPr>
+      <w:r>
+        <w:rPr>
+          <w:rFonts w:ascii="Times New Roman" w:eastAsia="Times New Roman" w:hAnsi="Times New Roman" w:cs="Times New Roman"/>
+          <w:sz w:val="24"/>
+          <w:szCs w:val="24"/>
+          <w:lang w:eastAsia="en-IN"/>
+        </w:rPr>
+        <w:t xml:space="preserve">Get running sum (before/after — decide carefully) </w:t>
+      </w:r>
+    </w:p>
+    <w:p>
+      <w:pPr>
+        <w:numPr>
+          <w:ilvl w:val="0"/>
+          <w:numId w:val="9"/>
+        </w:numPr>
+        <w:spacing w:before="100" w:beforeAutospacing="1" w:after="100" w:afterAutospacing="1" w:line="240" w:lineRule="auto"/>
+        <w:rPr>
+          <w:rFonts w:ascii="Times New Roman" w:eastAsia="Times New Roman" w:hAnsi="Times New Roman" w:cs="Times New Roman"/>
+          <w:sz w:val="24"/>
+          <w:szCs w:val="24"/>
+          <w:lang w:eastAsia="en-IN"/>
+        </w:rPr>
+      </w:pPr>
+      <w:r>
+        <w:rPr>
+          <w:rFonts w:ascii="Times New Roman" w:eastAsia="Times New Roman" w:hAnsi="Times New Roman" w:cs="Times New Roman"/>
+          <w:sz w:val="24"/>
+          <w:szCs w:val="24"/>
+          <w:lang w:eastAsia="en-IN"/>
+        </w:rPr>
+        <w:t xml:space="preserve">Build value </w:t>
+      </w:r>
+    </w:p>
+    <w:p>
+      <w:pPr>
+        <w:numPr>
+          <w:ilvl w:val="0"/>
+          <w:numId w:val="9"/>
+        </w:numPr>
+        <w:spacing w:before="100" w:beforeAutospacing="1" w:after="100" w:afterAutospacing="1" w:line="240" w:lineRule="auto"/>
+        <w:rPr>
+          <w:rFonts w:ascii="Times New Roman" w:eastAsia="Times New Roman" w:hAnsi="Times New Roman" w:cs="Times New Roman"/>
+          <w:sz w:val="24"/>
+          <w:szCs w:val="24"/>
+          <w:lang w:eastAsia="en-IN"/>
+        </w:rPr>
+      </w:pPr>
+      <w:r>
+        <w:rPr>
+          <w:rFonts w:ascii="Times New Roman" w:eastAsia="Times New Roman" w:hAnsi="Times New Roman" w:cs="Times New Roman"/>
+          <w:sz w:val="24"/>
+          <w:szCs w:val="24"/>
+          <w:lang w:eastAsia="en-IN"/>
+        </w:rPr>
+        <w:t xml:space="preserve">Apply conditions </w:t>
       </w:r>
     </w:p>
     <w:p/>
@@ -3787,6 +6391,268 @@
     </w:lvl>
   </w:abstractNum>
   <w:abstractNum w:abstractNumId="1" w15:restartNumberingAfterBreak="0">
+    <w:nsid w:val="0D3C583F"/>
+    <w:multiLevelType w:val="multilevel"/>
+    <w:tmpl w:val="4454C94E"/>
+    <w:lvl w:ilvl="0">
+      <w:start w:val="1"/>
+      <w:numFmt w:val="bullet"/>
+      <w:lvlText w:val=""/>
+      <w:lvlJc w:val="left"/>
+      <w:pPr>
+        <w:tabs>
+          <w:tab w:val="num" w:pos="720"/>
+        </w:tabs>
+        <w:ind w:left="720" w:hanging="360"/>
+      </w:pPr>
+      <w:rPr>
+        <w:rFonts w:ascii="Symbol" w:hAnsi="Symbol" w:hint="default"/>
+        <w:sz w:val="20"/>
+      </w:rPr>
+    </w:lvl>
+    <w:lvl w:ilvl="1" w:tentative="1">
+      <w:start w:val="1"/>
+      <w:numFmt w:val="bullet"/>
+      <w:lvlText w:val="o"/>
+      <w:lvlJc w:val="left"/>
+      <w:pPr>
+        <w:tabs>
+          <w:tab w:val="num" w:pos="1440"/>
+        </w:tabs>
+        <w:ind w:left="1440" w:hanging="360"/>
+      </w:pPr>
+      <w:rPr>
+        <w:rFonts w:ascii="Courier New" w:hAnsi="Courier New" w:hint="default"/>
+        <w:sz w:val="20"/>
+      </w:rPr>
+    </w:lvl>
+    <w:lvl w:ilvl="2" w:tentative="1">
+      <w:start w:val="1"/>
+      <w:numFmt w:val="bullet"/>
+      <w:lvlText w:val=""/>
+      <w:lvlJc w:val="left"/>
+      <w:pPr>
+        <w:tabs>
+          <w:tab w:val="num" w:pos="2160"/>
+        </w:tabs>
+        <w:ind w:left="2160" w:hanging="360"/>
+      </w:pPr>
+      <w:rPr>
+        <w:rFonts w:ascii="Wingdings" w:hAnsi="Wingdings" w:hint="default"/>
+        <w:sz w:val="20"/>
+      </w:rPr>
+    </w:lvl>
+    <w:lvl w:ilvl="3" w:tentative="1">
+      <w:start w:val="1"/>
+      <w:numFmt w:val="bullet"/>
+      <w:lvlText w:val=""/>
+      <w:lvlJc w:val="left"/>
+      <w:pPr>
+        <w:tabs>
+          <w:tab w:val="num" w:pos="2880"/>
+        </w:tabs>
+        <w:ind w:left="2880" w:hanging="360"/>
+      </w:pPr>
+      <w:rPr>
+        <w:rFonts w:ascii="Wingdings" w:hAnsi="Wingdings" w:hint="default"/>
+        <w:sz w:val="20"/>
+      </w:rPr>
+    </w:lvl>
+    <w:lvl w:ilvl="4" w:tentative="1">
+      <w:start w:val="1"/>
+      <w:numFmt w:val="bullet"/>
+      <w:lvlText w:val=""/>
+      <w:lvlJc w:val="left"/>
+      <w:pPr>
+        <w:tabs>
+          <w:tab w:val="num" w:pos="3600"/>
+        </w:tabs>
+        <w:ind w:left="3600" w:hanging="360"/>
+      </w:pPr>
+      <w:rPr>
+        <w:rFonts w:ascii="Wingdings" w:hAnsi="Wingdings" w:hint="default"/>
+        <w:sz w:val="20"/>
+      </w:rPr>
+    </w:lvl>
+    <w:lvl w:ilvl="5" w:tentative="1">
+      <w:start w:val="1"/>
+      <w:numFmt w:val="bullet"/>
+      <w:lvlText w:val=""/>
+      <w:lvlJc w:val="left"/>
+      <w:pPr>
+        <w:tabs>
+          <w:tab w:val="num" w:pos="4320"/>
+        </w:tabs>
+        <w:ind w:left="4320" w:hanging="360"/>
+      </w:pPr>
+      <w:rPr>
+        <w:rFonts w:ascii="Wingdings" w:hAnsi="Wingdings" w:hint="default"/>
+        <w:sz w:val="20"/>
+      </w:rPr>
+    </w:lvl>
+    <w:lvl w:ilvl="6" w:tentative="1">
+      <w:start w:val="1"/>
+      <w:numFmt w:val="bullet"/>
+      <w:lvlText w:val=""/>
+      <w:lvlJc w:val="left"/>
+      <w:pPr>
+        <w:tabs>
+          <w:tab w:val="num" w:pos="5040"/>
+        </w:tabs>
+        <w:ind w:left="5040" w:hanging="360"/>
+      </w:pPr>
+      <w:rPr>
+        <w:rFonts w:ascii="Wingdings" w:hAnsi="Wingdings" w:hint="default"/>
+        <w:sz w:val="20"/>
+      </w:rPr>
+    </w:lvl>
+    <w:lvl w:ilvl="7" w:tentative="1">
+      <w:start w:val="1"/>
+      <w:numFmt w:val="bullet"/>
+      <w:lvlText w:val=""/>
+      <w:lvlJc w:val="left"/>
+      <w:pPr>
+        <w:tabs>
+          <w:tab w:val="num" w:pos="5760"/>
+        </w:tabs>
+        <w:ind w:left="5760" w:hanging="360"/>
+      </w:pPr>
+      <w:rPr>
+        <w:rFonts w:ascii="Wingdings" w:hAnsi="Wingdings" w:hint="default"/>
+        <w:sz w:val="20"/>
+      </w:rPr>
+    </w:lvl>
+    <w:lvl w:ilvl="8" w:tentative="1">
+      <w:start w:val="1"/>
+      <w:numFmt w:val="bullet"/>
+      <w:lvlText w:val=""/>
+      <w:lvlJc w:val="left"/>
+      <w:pPr>
+        <w:tabs>
+          <w:tab w:val="num" w:pos="6480"/>
+        </w:tabs>
+        <w:ind w:left="6480" w:hanging="360"/>
+      </w:pPr>
+      <w:rPr>
+        <w:rFonts w:ascii="Wingdings" w:hAnsi="Wingdings" w:hint="default"/>
+        <w:sz w:val="20"/>
+      </w:rPr>
+    </w:lvl>
+  </w:abstractNum>
+  <w:abstractNum w:abstractNumId="2" w15:restartNumberingAfterBreak="0">
+    <w:nsid w:val="16BF4D26"/>
+    <w:multiLevelType w:val="multilevel"/>
+    <w:tmpl w:val="EB56E0A2"/>
+    <w:lvl w:ilvl="0">
+      <w:start w:val="1"/>
+      <w:numFmt w:val="decimal"/>
+      <w:lvlText w:val="%1."/>
+      <w:lvlJc w:val="left"/>
+      <w:pPr>
+        <w:tabs>
+          <w:tab w:val="num" w:pos="720"/>
+        </w:tabs>
+        <w:ind w:left="720" w:hanging="360"/>
+      </w:pPr>
+    </w:lvl>
+    <w:lvl w:ilvl="1" w:tentative="1">
+      <w:start w:val="1"/>
+      <w:numFmt w:val="decimal"/>
+      <w:lvlText w:val="%2."/>
+      <w:lvlJc w:val="left"/>
+      <w:pPr>
+        <w:tabs>
+          <w:tab w:val="num" w:pos="1440"/>
+        </w:tabs>
+        <w:ind w:left="1440" w:hanging="360"/>
+      </w:pPr>
+    </w:lvl>
+    <w:lvl w:ilvl="2" w:tentative="1">
+      <w:start w:val="1"/>
+      <w:numFmt w:val="decimal"/>
+      <w:lvlText w:val="%3."/>
+      <w:lvlJc w:val="left"/>
+      <w:pPr>
+        <w:tabs>
+          <w:tab w:val="num" w:pos="2160"/>
+        </w:tabs>
+        <w:ind w:left="2160" w:hanging="360"/>
+      </w:pPr>
+    </w:lvl>
+    <w:lvl w:ilvl="3" w:tentative="1">
+      <w:start w:val="1"/>
+      <w:numFmt w:val="decimal"/>
+      <w:lvlText w:val="%4."/>
+      <w:lvlJc w:val="left"/>
+      <w:pPr>
+        <w:tabs>
+          <w:tab w:val="num" w:pos="2880"/>
+        </w:tabs>
+        <w:ind w:left="2880" w:hanging="360"/>
+      </w:pPr>
+    </w:lvl>
+    <w:lvl w:ilvl="4" w:tentative="1">
+      <w:start w:val="1"/>
+      <w:numFmt w:val="decimal"/>
+      <w:lvlText w:val="%5."/>
+      <w:lvlJc w:val="left"/>
+      <w:pPr>
+        <w:tabs>
+          <w:tab w:val="num" w:pos="3600"/>
+        </w:tabs>
+        <w:ind w:left="3600" w:hanging="360"/>
+      </w:pPr>
+    </w:lvl>
+    <w:lvl w:ilvl="5" w:tentative="1">
+      <w:start w:val="1"/>
+      <w:numFmt w:val="decimal"/>
+      <w:lvlText w:val="%6."/>
+      <w:lvlJc w:val="left"/>
+      <w:pPr>
+        <w:tabs>
+          <w:tab w:val="num" w:pos="4320"/>
+        </w:tabs>
+        <w:ind w:left="4320" w:hanging="360"/>
+      </w:pPr>
+    </w:lvl>
+    <w:lvl w:ilvl="6" w:tentative="1">
+      <w:start w:val="1"/>
+      <w:numFmt w:val="decimal"/>
+      <w:lvlText w:val="%7."/>
+      <w:lvlJc w:val="left"/>
+      <w:pPr>
+        <w:tabs>
+          <w:tab w:val="num" w:pos="5040"/>
+        </w:tabs>
+        <w:ind w:left="5040" w:hanging="360"/>
+      </w:pPr>
+    </w:lvl>
+    <w:lvl w:ilvl="7" w:tentative="1">
+      <w:start w:val="1"/>
+      <w:numFmt w:val="decimal"/>
+      <w:lvlText w:val="%8."/>
+      <w:lvlJc w:val="left"/>
+      <w:pPr>
+        <w:tabs>
+          <w:tab w:val="num" w:pos="5760"/>
+        </w:tabs>
+        <w:ind w:left="5760" w:hanging="360"/>
+      </w:pPr>
+    </w:lvl>
+    <w:lvl w:ilvl="8" w:tentative="1">
+      <w:start w:val="1"/>
+      <w:numFmt w:val="decimal"/>
+      <w:lvlText w:val="%9."/>
+      <w:lvlJc w:val="left"/>
+      <w:pPr>
+        <w:tabs>
+          <w:tab w:val="num" w:pos="6480"/>
+        </w:tabs>
+        <w:ind w:left="6480" w:hanging="360"/>
+      </w:pPr>
+    </w:lvl>
+  </w:abstractNum>
+  <w:abstractNum w:abstractNumId="3" w15:restartNumberingAfterBreak="0">
     <w:nsid w:val="17780362"/>
     <w:multiLevelType w:val="multilevel"/>
     <w:tmpl w:val="E1F044BC"/>
@@ -3899,7 +6765,7 @@
       </w:pPr>
     </w:lvl>
   </w:abstractNum>
-  <w:abstractNum w:abstractNumId="2" w15:restartNumberingAfterBreak="0">
+  <w:abstractNum w:abstractNumId="4" w15:restartNumberingAfterBreak="0">
     <w:nsid w:val="2B1C1030"/>
     <w:multiLevelType w:val="multilevel"/>
     <w:tmpl w:val="4C28FC2A"/>
@@ -4012,7 +6878,7 @@
       </w:pPr>
     </w:lvl>
   </w:abstractNum>
-  <w:abstractNum w:abstractNumId="3" w15:restartNumberingAfterBreak="0">
+  <w:abstractNum w:abstractNumId="5" w15:restartNumberingAfterBreak="0">
     <w:nsid w:val="42916B9B"/>
     <w:multiLevelType w:val="multilevel"/>
     <w:tmpl w:val="F4643990"/>
@@ -4125,7 +6991,7 @@
       </w:pPr>
     </w:lvl>
   </w:abstractNum>
-  <w:abstractNum w:abstractNumId="4" w15:restartNumberingAfterBreak="0">
+  <w:abstractNum w:abstractNumId="6" w15:restartNumberingAfterBreak="0">
     <w:nsid w:val="61024316"/>
     <w:multiLevelType w:val="multilevel"/>
     <w:tmpl w:val="B7F6DC94"/>
@@ -4238,7 +7104,7 @@
       </w:pPr>
     </w:lvl>
   </w:abstractNum>
-  <w:abstractNum w:abstractNumId="5" w15:restartNumberingAfterBreak="0">
+  <w:abstractNum w:abstractNumId="7" w15:restartNumberingAfterBreak="0">
     <w:nsid w:val="78DD0EB2"/>
     <w:multiLevelType w:val="multilevel"/>
     <w:tmpl w:val="EBE4269E"/>
@@ -4351,23 +7217,181 @@
       </w:pPr>
     </w:lvl>
   </w:abstractNum>
+  <w:abstractNum w:abstractNumId="8" w15:restartNumberingAfterBreak="0">
+    <w:nsid w:val="7C103974"/>
+    <w:multiLevelType w:val="multilevel"/>
+    <w:tmpl w:val="C90A2CCE"/>
+    <w:lvl w:ilvl="0">
+      <w:start w:val="1"/>
+      <w:numFmt w:val="bullet"/>
+      <w:lvlText w:val=""/>
+      <w:lvlJc w:val="left"/>
+      <w:pPr>
+        <w:tabs>
+          <w:tab w:val="num" w:pos="720"/>
+        </w:tabs>
+        <w:ind w:left="720" w:hanging="360"/>
+      </w:pPr>
+      <w:rPr>
+        <w:rFonts w:ascii="Symbol" w:hAnsi="Symbol" w:hint="default"/>
+        <w:sz w:val="20"/>
+      </w:rPr>
+    </w:lvl>
+    <w:lvl w:ilvl="1" w:tentative="1">
+      <w:start w:val="1"/>
+      <w:numFmt w:val="bullet"/>
+      <w:lvlText w:val="o"/>
+      <w:lvlJc w:val="left"/>
+      <w:pPr>
+        <w:tabs>
+          <w:tab w:val="num" w:pos="1440"/>
+        </w:tabs>
+        <w:ind w:left="1440" w:hanging="360"/>
+      </w:pPr>
+      <w:rPr>
+        <w:rFonts w:ascii="Courier New" w:hAnsi="Courier New" w:hint="default"/>
+        <w:sz w:val="20"/>
+      </w:rPr>
+    </w:lvl>
+    <w:lvl w:ilvl="2" w:tentative="1">
+      <w:start w:val="1"/>
+      <w:numFmt w:val="bullet"/>
+      <w:lvlText w:val=""/>
+      <w:lvlJc w:val="left"/>
+      <w:pPr>
+        <w:tabs>
+          <w:tab w:val="num" w:pos="2160"/>
+        </w:tabs>
+        <w:ind w:left="2160" w:hanging="360"/>
+      </w:pPr>
+      <w:rPr>
+        <w:rFonts w:ascii="Wingdings" w:hAnsi="Wingdings" w:hint="default"/>
+        <w:sz w:val="20"/>
+      </w:rPr>
+    </w:lvl>
+    <w:lvl w:ilvl="3" w:tentative="1">
+      <w:start w:val="1"/>
+      <w:numFmt w:val="bullet"/>
+      <w:lvlText w:val=""/>
+      <w:lvlJc w:val="left"/>
+      <w:pPr>
+        <w:tabs>
+          <w:tab w:val="num" w:pos="2880"/>
+        </w:tabs>
+        <w:ind w:left="2880" w:hanging="360"/>
+      </w:pPr>
+      <w:rPr>
+        <w:rFonts w:ascii="Wingdings" w:hAnsi="Wingdings" w:hint="default"/>
+        <w:sz w:val="20"/>
+      </w:rPr>
+    </w:lvl>
+    <w:lvl w:ilvl="4" w:tentative="1">
+      <w:start w:val="1"/>
+      <w:numFmt w:val="bullet"/>
+      <w:lvlText w:val=""/>
+      <w:lvlJc w:val="left"/>
+      <w:pPr>
+        <w:tabs>
+          <w:tab w:val="num" w:pos="3600"/>
+        </w:tabs>
+        <w:ind w:left="3600" w:hanging="360"/>
+      </w:pPr>
+      <w:rPr>
+        <w:rFonts w:ascii="Wingdings" w:hAnsi="Wingdings" w:hint="default"/>
+        <w:sz w:val="20"/>
+      </w:rPr>
+    </w:lvl>
+    <w:lvl w:ilvl="5" w:tentative="1">
+      <w:start w:val="1"/>
+      <w:numFmt w:val="bullet"/>
+      <w:lvlText w:val=""/>
+      <w:lvlJc w:val="left"/>
+      <w:pPr>
+        <w:tabs>
+          <w:tab w:val="num" w:pos="4320"/>
+        </w:tabs>
+        <w:ind w:left="4320" w:hanging="360"/>
+      </w:pPr>
+      <w:rPr>
+        <w:rFonts w:ascii="Wingdings" w:hAnsi="Wingdings" w:hint="default"/>
+        <w:sz w:val="20"/>
+      </w:rPr>
+    </w:lvl>
+    <w:lvl w:ilvl="6" w:tentative="1">
+      <w:start w:val="1"/>
+      <w:numFmt w:val="bullet"/>
+      <w:lvlText w:val=""/>
+      <w:lvlJc w:val="left"/>
+      <w:pPr>
+        <w:tabs>
+          <w:tab w:val="num" w:pos="5040"/>
+        </w:tabs>
+        <w:ind w:left="5040" w:hanging="360"/>
+      </w:pPr>
+      <w:rPr>
+        <w:rFonts w:ascii="Wingdings" w:hAnsi="Wingdings" w:hint="default"/>
+        <w:sz w:val="20"/>
+      </w:rPr>
+    </w:lvl>
+    <w:lvl w:ilvl="7" w:tentative="1">
+      <w:start w:val="1"/>
+      <w:numFmt w:val="bullet"/>
+      <w:lvlText w:val=""/>
+      <w:lvlJc w:val="left"/>
+      <w:pPr>
+        <w:tabs>
+          <w:tab w:val="num" w:pos="5760"/>
+        </w:tabs>
+        <w:ind w:left="5760" w:hanging="360"/>
+      </w:pPr>
+      <w:rPr>
+        <w:rFonts w:ascii="Wingdings" w:hAnsi="Wingdings" w:hint="default"/>
+        <w:sz w:val="20"/>
+      </w:rPr>
+    </w:lvl>
+    <w:lvl w:ilvl="8" w:tentative="1">
+      <w:start w:val="1"/>
+      <w:numFmt w:val="bullet"/>
+      <w:lvlText w:val=""/>
+      <w:lvlJc w:val="left"/>
+      <w:pPr>
+        <w:tabs>
+          <w:tab w:val="num" w:pos="6480"/>
+        </w:tabs>
+        <w:ind w:left="6480" w:hanging="360"/>
+      </w:pPr>
+      <w:rPr>
+        <w:rFonts w:ascii="Wingdings" w:hAnsi="Wingdings" w:hint="default"/>
+        <w:sz w:val="20"/>
+      </w:rPr>
+    </w:lvl>
+  </w:abstractNum>
   <w:num w:numId="1" w16cid:durableId="1054812913">
     <w:abstractNumId w:val="0"/>
   </w:num>
   <w:num w:numId="2" w16cid:durableId="2061897818">
+    <w:abstractNumId w:val="3"/>
+  </w:num>
+  <w:num w:numId="3" w16cid:durableId="1931422458">
+    <w:abstractNumId w:val="4"/>
+  </w:num>
+  <w:num w:numId="4" w16cid:durableId="1831752385">
+    <w:abstractNumId w:val="6"/>
+  </w:num>
+  <w:num w:numId="5" w16cid:durableId="1863664700">
+    <w:abstractNumId w:val="7"/>
+  </w:num>
+  <w:num w:numId="6" w16cid:durableId="1952201684">
+    <w:abstractNumId w:val="5"/>
+  </w:num>
+  <w:num w:numId="7" w16cid:durableId="1417283179">
+    <w:abstractNumId w:val="8"/>
+  </w:num>
+  <w:num w:numId="8" w16cid:durableId="1943679903">
     <w:abstractNumId w:val="1"/>
   </w:num>
-  <w:num w:numId="3" w16cid:durableId="1931422458">
+  <w:num w:numId="9" w16cid:durableId="563368675">
     <w:abstractNumId w:val="2"/>
-  </w:num>
-  <w:num w:numId="4" w16cid:durableId="1831752385">
-    <w:abstractNumId w:val="4"/>
-  </w:num>
-  <w:num w:numId="5" w16cid:durableId="1863664700">
-    <w:abstractNumId w:val="5"/>
-  </w:num>
-  <w:num w:numId="6" w16cid:durableId="1952201684">
-    <w:abstractNumId w:val="3"/>
   </w:num>
 </w:numbering>
 </file>

</xml_diff>